<commit_message>
Criacao da estrutura de classes para o algoritmo genetico.
</commit_message>
<xml_diff>
--- a/docs/RELATORIO_TechChallenge_FASE2.docx
+++ b/docs/RELATORIO_TechChallenge_FASE2.docx
@@ -61,7 +61,10 @@
         <w:jc w:val="center"/>
       </w:pPr>
       <w:r>
-        <w:t>Tech Challenge – Fase 1</w:t>
+        <w:t xml:space="preserve">Tech Challenge – Fase </w:t>
+      </w:r>
+      <w:r>
+        <w:t>2</w:t>
       </w:r>
     </w:p>
     <w:p>
@@ -245,7 +248,7 @@
           <w:r>
             <w:fldChar w:fldCharType="separate"/>
           </w:r>
-          <w:hyperlink w:anchor="_Toc219843008" w:history="1">
+          <w:hyperlink w:anchor="_Toc221432116" w:history="1">
             <w:r>
               <w:rPr>
                 <w:rStyle w:val="Hyperlink"/>
@@ -272,7 +275,77 @@
                 <w:noProof/>
                 <w:webHidden/>
               </w:rPr>
-              <w:instrText xml:space="preserve"> PAGEREF _Toc219843008 \h </w:instrText>
+              <w:instrText xml:space="preserve"> PAGEREF _Toc221432116 \h </w:instrText>
+            </w:r>
+            <w:r>
+              <w:rPr>
+                <w:noProof/>
+                <w:webHidden/>
+              </w:rPr>
+            </w:r>
+            <w:r>
+              <w:rPr>
+                <w:noProof/>
+                <w:webHidden/>
+              </w:rPr>
+              <w:fldChar w:fldCharType="separate"/>
+            </w:r>
+            <w:r>
+              <w:rPr>
+                <w:noProof/>
+                <w:webHidden/>
+              </w:rPr>
+              <w:t>3</w:t>
+            </w:r>
+            <w:r>
+              <w:rPr>
+                <w:noProof/>
+                <w:webHidden/>
+              </w:rPr>
+              <w:fldChar w:fldCharType="end"/>
+            </w:r>
+          </w:hyperlink>
+        </w:p>
+        <w:p>
+          <w:pPr>
+            <w:pStyle w:val="Sumrio1"/>
+            <w:tabs>
+              <w:tab w:val="right" w:leader="dot" w:pos="8494"/>
+            </w:tabs>
+            <w:rPr>
+              <w:rFonts w:eastAsiaTheme="minorEastAsia"/>
+              <w:noProof/>
+              <w:lang w:eastAsia="pt-BR"/>
+            </w:rPr>
+          </w:pPr>
+          <w:hyperlink w:anchor="_Toc221432117" w:history="1">
+            <w:r>
+              <w:rPr>
+                <w:rStyle w:val="Hyperlink"/>
+                <w:noProof/>
+              </w:rPr>
+              <w:t>Montagem do ambiente</w:t>
+            </w:r>
+            <w:r>
+              <w:rPr>
+                <w:noProof/>
+                <w:webHidden/>
+              </w:rPr>
+              <w:tab/>
+            </w:r>
+            <w:r>
+              <w:rPr>
+                <w:noProof/>
+                <w:webHidden/>
+              </w:rPr>
+              <w:fldChar w:fldCharType="begin"/>
+            </w:r>
+            <w:r>
+              <w:rPr>
+                <w:noProof/>
+                <w:webHidden/>
+              </w:rPr>
+              <w:instrText xml:space="preserve"> PAGEREF _Toc221432117 \h </w:instrText>
             </w:r>
             <w:r>
               <w:rPr>
@@ -305,7 +378,7 @@
         </w:p>
         <w:p>
           <w:pPr>
-            <w:pStyle w:val="Sumrio1"/>
+            <w:pStyle w:val="Sumrio2"/>
             <w:tabs>
               <w:tab w:val="right" w:leader="dot" w:pos="8494"/>
             </w:tabs>
@@ -315,13 +388,13 @@
               <w:lang w:eastAsia="pt-BR"/>
             </w:rPr>
           </w:pPr>
-          <w:hyperlink w:anchor="_Toc219843009" w:history="1">
+          <w:hyperlink w:anchor="_Toc221432118" w:history="1">
             <w:r>
               <w:rPr>
                 <w:rStyle w:val="Hyperlink"/>
                 <w:noProof/>
               </w:rPr>
-              <w:t>Montagem do ambiente</w:t>
+              <w:t>OB Studio</w:t>
             </w:r>
             <w:r>
               <w:rPr>
@@ -342,7 +415,217 @@
                 <w:noProof/>
                 <w:webHidden/>
               </w:rPr>
-              <w:instrText xml:space="preserve"> PAGEREF _Toc219843009 \h </w:instrText>
+              <w:instrText xml:space="preserve"> PAGEREF _Toc221432118 \h </w:instrText>
+            </w:r>
+            <w:r>
+              <w:rPr>
+                <w:noProof/>
+                <w:webHidden/>
+              </w:rPr>
+            </w:r>
+            <w:r>
+              <w:rPr>
+                <w:noProof/>
+                <w:webHidden/>
+              </w:rPr>
+              <w:fldChar w:fldCharType="separate"/>
+            </w:r>
+            <w:r>
+              <w:rPr>
+                <w:noProof/>
+                <w:webHidden/>
+              </w:rPr>
+              <w:t>4</w:t>
+            </w:r>
+            <w:r>
+              <w:rPr>
+                <w:noProof/>
+                <w:webHidden/>
+              </w:rPr>
+              <w:fldChar w:fldCharType="end"/>
+            </w:r>
+          </w:hyperlink>
+        </w:p>
+        <w:p>
+          <w:pPr>
+            <w:pStyle w:val="Sumrio2"/>
+            <w:tabs>
+              <w:tab w:val="right" w:leader="dot" w:pos="8494"/>
+            </w:tabs>
+            <w:rPr>
+              <w:rFonts w:eastAsiaTheme="minorEastAsia"/>
+              <w:noProof/>
+              <w:lang w:eastAsia="pt-BR"/>
+            </w:rPr>
+          </w:pPr>
+          <w:hyperlink w:anchor="_Toc221432119" w:history="1">
+            <w:r>
+              <w:rPr>
+                <w:rStyle w:val="Hyperlink"/>
+                <w:noProof/>
+              </w:rPr>
+              <w:t>Ambiente Python</w:t>
+            </w:r>
+            <w:r>
+              <w:rPr>
+                <w:noProof/>
+                <w:webHidden/>
+              </w:rPr>
+              <w:tab/>
+            </w:r>
+            <w:r>
+              <w:rPr>
+                <w:noProof/>
+                <w:webHidden/>
+              </w:rPr>
+              <w:fldChar w:fldCharType="begin"/>
+            </w:r>
+            <w:r>
+              <w:rPr>
+                <w:noProof/>
+                <w:webHidden/>
+              </w:rPr>
+              <w:instrText xml:space="preserve"> PAGEREF _Toc221432119 \h </w:instrText>
+            </w:r>
+            <w:r>
+              <w:rPr>
+                <w:noProof/>
+                <w:webHidden/>
+              </w:rPr>
+            </w:r>
+            <w:r>
+              <w:rPr>
+                <w:noProof/>
+                <w:webHidden/>
+              </w:rPr>
+              <w:fldChar w:fldCharType="separate"/>
+            </w:r>
+            <w:r>
+              <w:rPr>
+                <w:noProof/>
+                <w:webHidden/>
+              </w:rPr>
+              <w:t>4</w:t>
+            </w:r>
+            <w:r>
+              <w:rPr>
+                <w:noProof/>
+                <w:webHidden/>
+              </w:rPr>
+              <w:fldChar w:fldCharType="end"/>
+            </w:r>
+          </w:hyperlink>
+        </w:p>
+        <w:p>
+          <w:pPr>
+            <w:pStyle w:val="Sumrio2"/>
+            <w:tabs>
+              <w:tab w:val="right" w:leader="dot" w:pos="8494"/>
+            </w:tabs>
+            <w:rPr>
+              <w:rFonts w:eastAsiaTheme="minorEastAsia"/>
+              <w:noProof/>
+              <w:lang w:eastAsia="pt-BR"/>
+            </w:rPr>
+          </w:pPr>
+          <w:hyperlink w:anchor="_Toc221432120" w:history="1">
+            <w:r>
+              <w:rPr>
+                <w:rStyle w:val="Hyperlink"/>
+                <w:noProof/>
+              </w:rPr>
+              <w:t>Extensões do CURSOR</w:t>
+            </w:r>
+            <w:r>
+              <w:rPr>
+                <w:noProof/>
+                <w:webHidden/>
+              </w:rPr>
+              <w:tab/>
+            </w:r>
+            <w:r>
+              <w:rPr>
+                <w:noProof/>
+                <w:webHidden/>
+              </w:rPr>
+              <w:fldChar w:fldCharType="begin"/>
+            </w:r>
+            <w:r>
+              <w:rPr>
+                <w:noProof/>
+                <w:webHidden/>
+              </w:rPr>
+              <w:instrText xml:space="preserve"> PAGEREF _Toc221432120 \h </w:instrText>
+            </w:r>
+            <w:r>
+              <w:rPr>
+                <w:noProof/>
+                <w:webHidden/>
+              </w:rPr>
+            </w:r>
+            <w:r>
+              <w:rPr>
+                <w:noProof/>
+                <w:webHidden/>
+              </w:rPr>
+              <w:fldChar w:fldCharType="separate"/>
+            </w:r>
+            <w:r>
+              <w:rPr>
+                <w:noProof/>
+                <w:webHidden/>
+              </w:rPr>
+              <w:t>4</w:t>
+            </w:r>
+            <w:r>
+              <w:rPr>
+                <w:noProof/>
+                <w:webHidden/>
+              </w:rPr>
+              <w:fldChar w:fldCharType="end"/>
+            </w:r>
+          </w:hyperlink>
+        </w:p>
+        <w:p>
+          <w:pPr>
+            <w:pStyle w:val="Sumrio2"/>
+            <w:tabs>
+              <w:tab w:val="right" w:leader="dot" w:pos="8494"/>
+            </w:tabs>
+            <w:rPr>
+              <w:rFonts w:eastAsiaTheme="minorEastAsia"/>
+              <w:noProof/>
+              <w:lang w:eastAsia="pt-BR"/>
+            </w:rPr>
+          </w:pPr>
+          <w:hyperlink w:anchor="_Toc221432121" w:history="1">
+            <w:r>
+              <w:rPr>
+                <w:rStyle w:val="Hyperlink"/>
+                <w:noProof/>
+              </w:rPr>
+              <w:t>Ambiente do GIT</w:t>
+            </w:r>
+            <w:r>
+              <w:rPr>
+                <w:noProof/>
+                <w:webHidden/>
+              </w:rPr>
+              <w:tab/>
+            </w:r>
+            <w:r>
+              <w:rPr>
+                <w:noProof/>
+                <w:webHidden/>
+              </w:rPr>
+              <w:fldChar w:fldCharType="begin"/>
+            </w:r>
+            <w:r>
+              <w:rPr>
+                <w:noProof/>
+                <w:webHidden/>
+              </w:rPr>
+              <w:instrText xml:space="preserve"> PAGEREF _Toc221432121 \h </w:instrText>
             </w:r>
             <w:r>
               <w:rPr>
@@ -375,7 +658,7 @@
         </w:p>
         <w:p>
           <w:pPr>
-            <w:pStyle w:val="Sumrio2"/>
+            <w:pStyle w:val="Sumrio1"/>
             <w:tabs>
               <w:tab w:val="right" w:leader="dot" w:pos="8494"/>
             </w:tabs>
@@ -385,13 +668,13 @@
               <w:lang w:eastAsia="pt-BR"/>
             </w:rPr>
           </w:pPr>
-          <w:hyperlink w:anchor="_Toc219843010" w:history="1">
+          <w:hyperlink w:anchor="_Toc221432122" w:history="1">
             <w:r>
               <w:rPr>
                 <w:rStyle w:val="Hyperlink"/>
                 <w:noProof/>
               </w:rPr>
-              <w:t>OB Studio</w:t>
+              <w:t>TITULO 1</w:t>
             </w:r>
             <w:r>
               <w:rPr>
@@ -412,147 +695,7 @@
                 <w:noProof/>
                 <w:webHidden/>
               </w:rPr>
-              <w:instrText xml:space="preserve"> PAGEREF _Toc219843010 \h </w:instrText>
-            </w:r>
-            <w:r>
-              <w:rPr>
-                <w:noProof/>
-                <w:webHidden/>
-              </w:rPr>
-            </w:r>
-            <w:r>
-              <w:rPr>
-                <w:noProof/>
-                <w:webHidden/>
-              </w:rPr>
-              <w:fldChar w:fldCharType="separate"/>
-            </w:r>
-            <w:r>
-              <w:rPr>
-                <w:noProof/>
-                <w:webHidden/>
-              </w:rPr>
-              <w:t>5</w:t>
-            </w:r>
-            <w:r>
-              <w:rPr>
-                <w:noProof/>
-                <w:webHidden/>
-              </w:rPr>
-              <w:fldChar w:fldCharType="end"/>
-            </w:r>
-          </w:hyperlink>
-        </w:p>
-        <w:p>
-          <w:pPr>
-            <w:pStyle w:val="Sumrio2"/>
-            <w:tabs>
-              <w:tab w:val="right" w:leader="dot" w:pos="8494"/>
-            </w:tabs>
-            <w:rPr>
-              <w:rFonts w:eastAsiaTheme="minorEastAsia"/>
-              <w:noProof/>
-              <w:lang w:eastAsia="pt-BR"/>
-            </w:rPr>
-          </w:pPr>
-          <w:hyperlink w:anchor="_Toc219843011" w:history="1">
-            <w:r>
-              <w:rPr>
-                <w:rStyle w:val="Hyperlink"/>
-                <w:noProof/>
-              </w:rPr>
-              <w:t>Ambiente Python</w:t>
-            </w:r>
-            <w:r>
-              <w:rPr>
-                <w:noProof/>
-                <w:webHidden/>
-              </w:rPr>
-              <w:tab/>
-            </w:r>
-            <w:r>
-              <w:rPr>
-                <w:noProof/>
-                <w:webHidden/>
-              </w:rPr>
-              <w:fldChar w:fldCharType="begin"/>
-            </w:r>
-            <w:r>
-              <w:rPr>
-                <w:noProof/>
-                <w:webHidden/>
-              </w:rPr>
-              <w:instrText xml:space="preserve"> PAGEREF _Toc219843011 \h </w:instrText>
-            </w:r>
-            <w:r>
-              <w:rPr>
-                <w:noProof/>
-                <w:webHidden/>
-              </w:rPr>
-            </w:r>
-            <w:r>
-              <w:rPr>
-                <w:noProof/>
-                <w:webHidden/>
-              </w:rPr>
-              <w:fldChar w:fldCharType="separate"/>
-            </w:r>
-            <w:r>
-              <w:rPr>
-                <w:noProof/>
-                <w:webHidden/>
-              </w:rPr>
-              <w:t>5</w:t>
-            </w:r>
-            <w:r>
-              <w:rPr>
-                <w:noProof/>
-                <w:webHidden/>
-              </w:rPr>
-              <w:fldChar w:fldCharType="end"/>
-            </w:r>
-          </w:hyperlink>
-        </w:p>
-        <w:p>
-          <w:pPr>
-            <w:pStyle w:val="Sumrio2"/>
-            <w:tabs>
-              <w:tab w:val="right" w:leader="dot" w:pos="8494"/>
-            </w:tabs>
-            <w:rPr>
-              <w:rFonts w:eastAsiaTheme="minorEastAsia"/>
-              <w:noProof/>
-              <w:lang w:eastAsia="pt-BR"/>
-            </w:rPr>
-          </w:pPr>
-          <w:hyperlink w:anchor="_Toc219843012" w:history="1">
-            <w:r>
-              <w:rPr>
-                <w:rStyle w:val="Hyperlink"/>
-                <w:noProof/>
-              </w:rPr>
-              <w:t>Extensões do Visual Studio Code</w:t>
-            </w:r>
-            <w:r>
-              <w:rPr>
-                <w:noProof/>
-                <w:webHidden/>
-              </w:rPr>
-              <w:tab/>
-            </w:r>
-            <w:r>
-              <w:rPr>
-                <w:noProof/>
-                <w:webHidden/>
-              </w:rPr>
-              <w:fldChar w:fldCharType="begin"/>
-            </w:r>
-            <w:r>
-              <w:rPr>
-                <w:noProof/>
-                <w:webHidden/>
-              </w:rPr>
-              <w:instrText xml:space="preserve"> PAGEREF _Toc219843012 \h </w:instrText>
+              <w:instrText xml:space="preserve"> PAGEREF _Toc221432122 \h </w:instrText>
             </w:r>
             <w:r>
               <w:rPr>
@@ -587,6 +730,7 @@
           <w:pPr>
             <w:pStyle w:val="Sumrio2"/>
             <w:tabs>
+              <w:tab w:val="left" w:pos="720"/>
               <w:tab w:val="right" w:leader="dot" w:pos="8494"/>
             </w:tabs>
             <w:rPr>
@@ -595,13 +739,28 @@
               <w:lang w:eastAsia="pt-BR"/>
             </w:rPr>
           </w:pPr>
-          <w:hyperlink w:anchor="_Toc219843013" w:history="1">
+          <w:hyperlink w:anchor="_Toc221432123" w:history="1">
             <w:r>
               <w:rPr>
                 <w:rStyle w:val="Hyperlink"/>
                 <w:noProof/>
               </w:rPr>
-              <w:t>Ambiente do GIT</w:t>
+              <w:t>1.</w:t>
+            </w:r>
+            <w:r>
+              <w:rPr>
+                <w:rFonts w:eastAsiaTheme="minorEastAsia"/>
+                <w:noProof/>
+                <w:lang w:eastAsia="pt-BR"/>
+              </w:rPr>
+              <w:tab/>
+            </w:r>
+            <w:r>
+              <w:rPr>
+                <w:rStyle w:val="Hyperlink"/>
+                <w:noProof/>
+              </w:rPr>
+              <w:t>TITULO 2</w:t>
             </w:r>
             <w:r>
               <w:rPr>
@@ -622,7 +781,7 @@
                 <w:noProof/>
                 <w:webHidden/>
               </w:rPr>
-              <w:instrText xml:space="preserve"> PAGEREF _Toc219843013 \h </w:instrText>
+              <w:instrText xml:space="preserve"> PAGEREF _Toc221432123 \h </w:instrText>
             </w:r>
             <w:r>
               <w:rPr>
@@ -642,163 +801,7 @@
                 <w:noProof/>
                 <w:webHidden/>
               </w:rPr>
-              <w:t>7</w:t>
-            </w:r>
-            <w:r>
-              <w:rPr>
-                <w:noProof/>
-                <w:webHidden/>
-              </w:rPr>
-              <w:fldChar w:fldCharType="end"/>
-            </w:r>
-          </w:hyperlink>
-        </w:p>
-        <w:p>
-          <w:pPr>
-            <w:pStyle w:val="Sumrio1"/>
-            <w:tabs>
-              <w:tab w:val="right" w:leader="dot" w:pos="8494"/>
-            </w:tabs>
-            <w:rPr>
-              <w:rFonts w:eastAsiaTheme="minorEastAsia"/>
-              <w:noProof/>
-              <w:lang w:eastAsia="pt-BR"/>
-            </w:rPr>
-          </w:pPr>
-          <w:hyperlink w:anchor="_Toc219843014" w:history="1">
-            <w:r>
-              <w:rPr>
-                <w:rStyle w:val="Hyperlink"/>
-                <w:noProof/>
-              </w:rPr>
-              <w:t>Ciclo de vida do projeto de ML</w:t>
-            </w:r>
-            <w:r>
-              <w:rPr>
-                <w:noProof/>
-                <w:webHidden/>
-              </w:rPr>
-              <w:tab/>
-            </w:r>
-            <w:r>
-              <w:rPr>
-                <w:noProof/>
-                <w:webHidden/>
-              </w:rPr>
-              <w:fldChar w:fldCharType="begin"/>
-            </w:r>
-            <w:r>
-              <w:rPr>
-                <w:noProof/>
-                <w:webHidden/>
-              </w:rPr>
-              <w:instrText xml:space="preserve"> PAGEREF _Toc219843014 \h </w:instrText>
-            </w:r>
-            <w:r>
-              <w:rPr>
-                <w:noProof/>
-                <w:webHidden/>
-              </w:rPr>
-            </w:r>
-            <w:r>
-              <w:rPr>
-                <w:noProof/>
-                <w:webHidden/>
-              </w:rPr>
-              <w:fldChar w:fldCharType="separate"/>
-            </w:r>
-            <w:r>
-              <w:rPr>
-                <w:noProof/>
-                <w:webHidden/>
-              </w:rPr>
-              <w:t>8</w:t>
-            </w:r>
-            <w:r>
-              <w:rPr>
-                <w:noProof/>
-                <w:webHidden/>
-              </w:rPr>
-              <w:fldChar w:fldCharType="end"/>
-            </w:r>
-          </w:hyperlink>
-        </w:p>
-        <w:p>
-          <w:pPr>
-            <w:pStyle w:val="Sumrio2"/>
-            <w:tabs>
-              <w:tab w:val="left" w:pos="720"/>
-              <w:tab w:val="right" w:leader="dot" w:pos="8494"/>
-            </w:tabs>
-            <w:rPr>
-              <w:rFonts w:eastAsiaTheme="minorEastAsia"/>
-              <w:noProof/>
-              <w:lang w:eastAsia="pt-BR"/>
-            </w:rPr>
-          </w:pPr>
-          <w:hyperlink w:anchor="_Toc219843015" w:history="1">
-            <w:r>
-              <w:rPr>
-                <w:rStyle w:val="Hyperlink"/>
-                <w:noProof/>
-              </w:rPr>
-              <w:t>1.</w:t>
-            </w:r>
-            <w:r>
-              <w:rPr>
-                <w:rFonts w:eastAsiaTheme="minorEastAsia"/>
-                <w:noProof/>
-                <w:lang w:eastAsia="pt-BR"/>
-              </w:rPr>
-              <w:tab/>
-            </w:r>
-            <w:r>
-              <w:rPr>
-                <w:rStyle w:val="Hyperlink"/>
-                <w:noProof/>
-              </w:rPr>
-              <w:t>Coleta os dados</w:t>
-            </w:r>
-            <w:r>
-              <w:rPr>
-                <w:noProof/>
-                <w:webHidden/>
-              </w:rPr>
-              <w:tab/>
-            </w:r>
-            <w:r>
-              <w:rPr>
-                <w:noProof/>
-                <w:webHidden/>
-              </w:rPr>
-              <w:fldChar w:fldCharType="begin"/>
-            </w:r>
-            <w:r>
-              <w:rPr>
-                <w:noProof/>
-                <w:webHidden/>
-              </w:rPr>
-              <w:instrText xml:space="preserve"> PAGEREF _Toc219843015 \h </w:instrText>
-            </w:r>
-            <w:r>
-              <w:rPr>
-                <w:noProof/>
-                <w:webHidden/>
-              </w:rPr>
-            </w:r>
-            <w:r>
-              <w:rPr>
-                <w:noProof/>
-                <w:webHidden/>
-              </w:rPr>
-              <w:fldChar w:fldCharType="separate"/>
-            </w:r>
-            <w:r>
-              <w:rPr>
-                <w:noProof/>
-                <w:webHidden/>
-              </w:rPr>
-              <w:t>9</w:t>
+              <w:t>6</w:t>
             </w:r>
             <w:r>
               <w:rPr>
@@ -821,7 +824,7 @@
               <w:lang w:eastAsia="pt-BR"/>
             </w:rPr>
           </w:pPr>
-          <w:hyperlink w:anchor="_Toc219843016" w:history="1">
+          <w:hyperlink w:anchor="_Toc221432124" w:history="1">
             <w:r>
               <w:rPr>
                 <w:rStyle w:val="Hyperlink"/>
@@ -829,7 +832,7 @@
                 <w:bCs/>
                 <w:noProof/>
               </w:rPr>
-              <w:t>Dataset escolhido</w:t>
+              <w:t>TITULO 3</w:t>
             </w:r>
             <w:r>
               <w:rPr>
@@ -850,7 +853,7 @@
                 <w:noProof/>
                 <w:webHidden/>
               </w:rPr>
-              <w:instrText xml:space="preserve"> PAGEREF _Toc219843016 \h </w:instrText>
+              <w:instrText xml:space="preserve"> PAGEREF _Toc221432124 \h </w:instrText>
             </w:r>
             <w:r>
               <w:rPr>
@@ -870,1508 +873,7 @@
                 <w:noProof/>
                 <w:webHidden/>
               </w:rPr>
-              <w:t>10</w:t>
-            </w:r>
-            <w:r>
-              <w:rPr>
-                <w:noProof/>
-                <w:webHidden/>
-              </w:rPr>
-              <w:fldChar w:fldCharType="end"/>
-            </w:r>
-          </w:hyperlink>
-        </w:p>
-        <w:p>
-          <w:pPr>
-            <w:pStyle w:val="Sumrio2"/>
-            <w:tabs>
-              <w:tab w:val="left" w:pos="720"/>
-              <w:tab w:val="right" w:leader="dot" w:pos="8494"/>
-            </w:tabs>
-            <w:rPr>
-              <w:rFonts w:eastAsiaTheme="minorEastAsia"/>
-              <w:noProof/>
-              <w:lang w:eastAsia="pt-BR"/>
-            </w:rPr>
-          </w:pPr>
-          <w:hyperlink w:anchor="_Toc219843017" w:history="1">
-            <w:r>
-              <w:rPr>
-                <w:rStyle w:val="Hyperlink"/>
-                <w:noProof/>
-              </w:rPr>
-              <w:t>2.</w:t>
-            </w:r>
-            <w:r>
-              <w:rPr>
-                <w:rFonts w:eastAsiaTheme="minorEastAsia"/>
-                <w:noProof/>
-                <w:lang w:eastAsia="pt-BR"/>
-              </w:rPr>
-              <w:tab/>
-            </w:r>
-            <w:r>
-              <w:rPr>
-                <w:rStyle w:val="Hyperlink"/>
-                <w:noProof/>
-              </w:rPr>
-              <w:t>Preparação dos Dados</w:t>
-            </w:r>
-            <w:r>
-              <w:rPr>
-                <w:noProof/>
-                <w:webHidden/>
-              </w:rPr>
-              <w:tab/>
-            </w:r>
-            <w:r>
-              <w:rPr>
-                <w:noProof/>
-                <w:webHidden/>
-              </w:rPr>
-              <w:fldChar w:fldCharType="begin"/>
-            </w:r>
-            <w:r>
-              <w:rPr>
-                <w:noProof/>
-                <w:webHidden/>
-              </w:rPr>
-              <w:instrText xml:space="preserve"> PAGEREF _Toc219843017 \h </w:instrText>
-            </w:r>
-            <w:r>
-              <w:rPr>
-                <w:noProof/>
-                <w:webHidden/>
-              </w:rPr>
-            </w:r>
-            <w:r>
-              <w:rPr>
-                <w:noProof/>
-                <w:webHidden/>
-              </w:rPr>
-              <w:fldChar w:fldCharType="separate"/>
-            </w:r>
-            <w:r>
-              <w:rPr>
-                <w:noProof/>
-                <w:webHidden/>
-              </w:rPr>
-              <w:t>12</w:t>
-            </w:r>
-            <w:r>
-              <w:rPr>
-                <w:noProof/>
-                <w:webHidden/>
-              </w:rPr>
-              <w:fldChar w:fldCharType="end"/>
-            </w:r>
-          </w:hyperlink>
-        </w:p>
-        <w:p>
-          <w:pPr>
-            <w:pStyle w:val="Sumrio3"/>
-            <w:tabs>
-              <w:tab w:val="right" w:leader="dot" w:pos="8494"/>
-            </w:tabs>
-            <w:rPr>
-              <w:rFonts w:eastAsiaTheme="minorEastAsia"/>
-              <w:noProof/>
-              <w:lang w:eastAsia="pt-BR"/>
-            </w:rPr>
-          </w:pPr>
-          <w:hyperlink w:anchor="_Toc219843018" w:history="1">
-            <w:r>
-              <w:rPr>
-                <w:rStyle w:val="Hyperlink"/>
-                <w:noProof/>
-              </w:rPr>
-              <w:t>Análise gráfica de fatores associados a hospitalização</w:t>
-            </w:r>
-            <w:r>
-              <w:rPr>
-                <w:noProof/>
-                <w:webHidden/>
-              </w:rPr>
-              <w:tab/>
-            </w:r>
-            <w:r>
-              <w:rPr>
-                <w:noProof/>
-                <w:webHidden/>
-              </w:rPr>
-              <w:fldChar w:fldCharType="begin"/>
-            </w:r>
-            <w:r>
-              <w:rPr>
-                <w:noProof/>
-                <w:webHidden/>
-              </w:rPr>
-              <w:instrText xml:space="preserve"> PAGEREF _Toc219843018 \h </w:instrText>
-            </w:r>
-            <w:r>
-              <w:rPr>
-                <w:noProof/>
-                <w:webHidden/>
-              </w:rPr>
-            </w:r>
-            <w:r>
-              <w:rPr>
-                <w:noProof/>
-                <w:webHidden/>
-              </w:rPr>
-              <w:fldChar w:fldCharType="separate"/>
-            </w:r>
-            <w:r>
-              <w:rPr>
-                <w:noProof/>
-                <w:webHidden/>
-              </w:rPr>
-              <w:t>13</w:t>
-            </w:r>
-            <w:r>
-              <w:rPr>
-                <w:noProof/>
-                <w:webHidden/>
-              </w:rPr>
-              <w:fldChar w:fldCharType="end"/>
-            </w:r>
-          </w:hyperlink>
-        </w:p>
-        <w:p>
-          <w:pPr>
-            <w:pStyle w:val="Sumrio3"/>
-            <w:tabs>
-              <w:tab w:val="left" w:pos="960"/>
-              <w:tab w:val="right" w:leader="dot" w:pos="8494"/>
-            </w:tabs>
-            <w:rPr>
-              <w:rFonts w:eastAsiaTheme="minorEastAsia"/>
-              <w:noProof/>
-              <w:lang w:eastAsia="pt-BR"/>
-            </w:rPr>
-          </w:pPr>
-          <w:hyperlink w:anchor="_Toc219843019" w:history="1">
-            <w:r>
-              <w:rPr>
-                <w:rStyle w:val="Hyperlink"/>
-                <w:b/>
-                <w:bCs/>
-                <w:noProof/>
-                <w:lang w:val="en-US"/>
-              </w:rPr>
-              <w:t>1.</w:t>
-            </w:r>
-            <w:r>
-              <w:rPr>
-                <w:rFonts w:eastAsiaTheme="minorEastAsia"/>
-                <w:noProof/>
-                <w:lang w:eastAsia="pt-BR"/>
-              </w:rPr>
-              <w:tab/>
-            </w:r>
-            <w:r>
-              <w:rPr>
-                <w:rStyle w:val="Hyperlink"/>
-                <w:noProof/>
-              </w:rPr>
-              <w:t>Fusão</w:t>
-            </w:r>
-            <w:r>
-              <w:rPr>
-                <w:noProof/>
-                <w:webHidden/>
-              </w:rPr>
-              <w:tab/>
-            </w:r>
-            <w:r>
-              <w:rPr>
-                <w:noProof/>
-                <w:webHidden/>
-              </w:rPr>
-              <w:fldChar w:fldCharType="begin"/>
-            </w:r>
-            <w:r>
-              <w:rPr>
-                <w:noProof/>
-                <w:webHidden/>
-              </w:rPr>
-              <w:instrText xml:space="preserve"> PAGEREF _Toc219843019 \h </w:instrText>
-            </w:r>
-            <w:r>
-              <w:rPr>
-                <w:noProof/>
-                <w:webHidden/>
-              </w:rPr>
-            </w:r>
-            <w:r>
-              <w:rPr>
-                <w:noProof/>
-                <w:webHidden/>
-              </w:rPr>
-              <w:fldChar w:fldCharType="separate"/>
-            </w:r>
-            <w:r>
-              <w:rPr>
-                <w:noProof/>
-                <w:webHidden/>
-              </w:rPr>
-              <w:t>17</w:t>
-            </w:r>
-            <w:r>
-              <w:rPr>
-                <w:noProof/>
-                <w:webHidden/>
-              </w:rPr>
-              <w:fldChar w:fldCharType="end"/>
-            </w:r>
-          </w:hyperlink>
-        </w:p>
-        <w:p>
-          <w:pPr>
-            <w:pStyle w:val="Sumrio3"/>
-            <w:tabs>
-              <w:tab w:val="left" w:pos="960"/>
-              <w:tab w:val="right" w:leader="dot" w:pos="8494"/>
-            </w:tabs>
-            <w:rPr>
-              <w:rFonts w:eastAsiaTheme="minorEastAsia"/>
-              <w:noProof/>
-              <w:lang w:eastAsia="pt-BR"/>
-            </w:rPr>
-          </w:pPr>
-          <w:hyperlink w:anchor="_Toc219843020" w:history="1">
-            <w:r>
-              <w:rPr>
-                <w:rStyle w:val="Hyperlink"/>
-                <w:b/>
-                <w:bCs/>
-                <w:noProof/>
-              </w:rPr>
-              <w:t>2.</w:t>
-            </w:r>
-            <w:r>
-              <w:rPr>
-                <w:rFonts w:eastAsiaTheme="minorEastAsia"/>
-                <w:noProof/>
-                <w:lang w:eastAsia="pt-BR"/>
-              </w:rPr>
-              <w:tab/>
-            </w:r>
-            <w:r>
-              <w:rPr>
-                <w:rStyle w:val="Hyperlink"/>
-                <w:noProof/>
-              </w:rPr>
-              <w:t>Validação</w:t>
-            </w:r>
-            <w:r>
-              <w:rPr>
-                <w:noProof/>
-                <w:webHidden/>
-              </w:rPr>
-              <w:tab/>
-            </w:r>
-            <w:r>
-              <w:rPr>
-                <w:noProof/>
-                <w:webHidden/>
-              </w:rPr>
-              <w:fldChar w:fldCharType="begin"/>
-            </w:r>
-            <w:r>
-              <w:rPr>
-                <w:noProof/>
-                <w:webHidden/>
-              </w:rPr>
-              <w:instrText xml:space="preserve"> PAGEREF _Toc219843020 \h </w:instrText>
-            </w:r>
-            <w:r>
-              <w:rPr>
-                <w:noProof/>
-                <w:webHidden/>
-              </w:rPr>
-            </w:r>
-            <w:r>
-              <w:rPr>
-                <w:noProof/>
-                <w:webHidden/>
-              </w:rPr>
-              <w:fldChar w:fldCharType="separate"/>
-            </w:r>
-            <w:r>
-              <w:rPr>
-                <w:noProof/>
-                <w:webHidden/>
-              </w:rPr>
-              <w:t>18</w:t>
-            </w:r>
-            <w:r>
-              <w:rPr>
-                <w:noProof/>
-                <w:webHidden/>
-              </w:rPr>
-              <w:fldChar w:fldCharType="end"/>
-            </w:r>
-          </w:hyperlink>
-        </w:p>
-        <w:p>
-          <w:pPr>
-            <w:pStyle w:val="Sumrio3"/>
-            <w:tabs>
-              <w:tab w:val="left" w:pos="960"/>
-              <w:tab w:val="right" w:leader="dot" w:pos="8494"/>
-            </w:tabs>
-            <w:rPr>
-              <w:rFonts w:eastAsiaTheme="minorEastAsia"/>
-              <w:noProof/>
-              <w:lang w:eastAsia="pt-BR"/>
-            </w:rPr>
-          </w:pPr>
-          <w:hyperlink w:anchor="_Toc219843021" w:history="1">
-            <w:r>
-              <w:rPr>
-                <w:rStyle w:val="Hyperlink"/>
-                <w:noProof/>
-              </w:rPr>
-              <w:t>3.</w:t>
-            </w:r>
-            <w:r>
-              <w:rPr>
-                <w:rFonts w:eastAsiaTheme="minorEastAsia"/>
-                <w:noProof/>
-                <w:lang w:eastAsia="pt-BR"/>
-              </w:rPr>
-              <w:tab/>
-            </w:r>
-            <w:r>
-              <w:rPr>
-                <w:rStyle w:val="Hyperlink"/>
-                <w:noProof/>
-              </w:rPr>
-              <w:t>Trivialidade</w:t>
-            </w:r>
-            <w:r>
-              <w:rPr>
-                <w:noProof/>
-                <w:webHidden/>
-              </w:rPr>
-              <w:tab/>
-            </w:r>
-            <w:r>
-              <w:rPr>
-                <w:noProof/>
-                <w:webHidden/>
-              </w:rPr>
-              <w:fldChar w:fldCharType="begin"/>
-            </w:r>
-            <w:r>
-              <w:rPr>
-                <w:noProof/>
-                <w:webHidden/>
-              </w:rPr>
-              <w:instrText xml:space="preserve"> PAGEREF _Toc219843021 \h </w:instrText>
-            </w:r>
-            <w:r>
-              <w:rPr>
-                <w:noProof/>
-                <w:webHidden/>
-              </w:rPr>
-            </w:r>
-            <w:r>
-              <w:rPr>
-                <w:noProof/>
-                <w:webHidden/>
-              </w:rPr>
-              <w:fldChar w:fldCharType="separate"/>
-            </w:r>
-            <w:r>
-              <w:rPr>
-                <w:noProof/>
-                <w:webHidden/>
-              </w:rPr>
-              <w:t>20</w:t>
-            </w:r>
-            <w:r>
-              <w:rPr>
-                <w:noProof/>
-                <w:webHidden/>
-              </w:rPr>
-              <w:fldChar w:fldCharType="end"/>
-            </w:r>
-          </w:hyperlink>
-        </w:p>
-        <w:p>
-          <w:pPr>
-            <w:pStyle w:val="Sumrio3"/>
-            <w:tabs>
-              <w:tab w:val="left" w:pos="960"/>
-              <w:tab w:val="right" w:leader="dot" w:pos="8494"/>
-            </w:tabs>
-            <w:rPr>
-              <w:rFonts w:eastAsiaTheme="minorEastAsia"/>
-              <w:noProof/>
-              <w:lang w:eastAsia="pt-BR"/>
-            </w:rPr>
-          </w:pPr>
-          <w:hyperlink w:anchor="_Toc219843022" w:history="1">
-            <w:r>
-              <w:rPr>
-                <w:rStyle w:val="Hyperlink"/>
-                <w:b/>
-                <w:bCs/>
-                <w:noProof/>
-              </w:rPr>
-              <w:t>4.</w:t>
-            </w:r>
-            <w:r>
-              <w:rPr>
-                <w:rFonts w:eastAsiaTheme="minorEastAsia"/>
-                <w:noProof/>
-                <w:lang w:eastAsia="pt-BR"/>
-              </w:rPr>
-              <w:tab/>
-            </w:r>
-            <w:r>
-              <w:rPr>
-                <w:rStyle w:val="Hyperlink"/>
-                <w:noProof/>
-              </w:rPr>
-              <w:t>Deduplicação</w:t>
-            </w:r>
-            <w:r>
-              <w:rPr>
-                <w:noProof/>
-                <w:webHidden/>
-              </w:rPr>
-              <w:tab/>
-            </w:r>
-            <w:r>
-              <w:rPr>
-                <w:noProof/>
-                <w:webHidden/>
-              </w:rPr>
-              <w:fldChar w:fldCharType="begin"/>
-            </w:r>
-            <w:r>
-              <w:rPr>
-                <w:noProof/>
-                <w:webHidden/>
-              </w:rPr>
-              <w:instrText xml:space="preserve"> PAGEREF _Toc219843022 \h </w:instrText>
-            </w:r>
-            <w:r>
-              <w:rPr>
-                <w:noProof/>
-                <w:webHidden/>
-              </w:rPr>
-            </w:r>
-            <w:r>
-              <w:rPr>
-                <w:noProof/>
-                <w:webHidden/>
-              </w:rPr>
-              <w:fldChar w:fldCharType="separate"/>
-            </w:r>
-            <w:r>
-              <w:rPr>
-                <w:noProof/>
-                <w:webHidden/>
-              </w:rPr>
-              <w:t>21</w:t>
-            </w:r>
-            <w:r>
-              <w:rPr>
-                <w:noProof/>
-                <w:webHidden/>
-              </w:rPr>
-              <w:fldChar w:fldCharType="end"/>
-            </w:r>
-          </w:hyperlink>
-        </w:p>
-        <w:p>
-          <w:pPr>
-            <w:pStyle w:val="Sumrio3"/>
-            <w:tabs>
-              <w:tab w:val="left" w:pos="960"/>
-              <w:tab w:val="right" w:leader="dot" w:pos="8494"/>
-            </w:tabs>
-            <w:rPr>
-              <w:rFonts w:eastAsiaTheme="minorEastAsia"/>
-              <w:noProof/>
-              <w:lang w:eastAsia="pt-BR"/>
-            </w:rPr>
-          </w:pPr>
-          <w:hyperlink w:anchor="_Toc219843023" w:history="1">
-            <w:r>
-              <w:rPr>
-                <w:rStyle w:val="Hyperlink"/>
-                <w:b/>
-                <w:bCs/>
-                <w:noProof/>
-              </w:rPr>
-              <w:t>5.</w:t>
-            </w:r>
-            <w:r>
-              <w:rPr>
-                <w:rFonts w:eastAsiaTheme="minorEastAsia"/>
-                <w:noProof/>
-                <w:lang w:eastAsia="pt-BR"/>
-              </w:rPr>
-              <w:tab/>
-            </w:r>
-            <w:r>
-              <w:rPr>
-                <w:rStyle w:val="Hyperlink"/>
-                <w:noProof/>
-              </w:rPr>
-              <w:t>Codificação/ Consistência</w:t>
-            </w:r>
-            <w:r>
-              <w:rPr>
-                <w:noProof/>
-                <w:webHidden/>
-              </w:rPr>
-              <w:tab/>
-            </w:r>
-            <w:r>
-              <w:rPr>
-                <w:noProof/>
-                <w:webHidden/>
-              </w:rPr>
-              <w:fldChar w:fldCharType="begin"/>
-            </w:r>
-            <w:r>
-              <w:rPr>
-                <w:noProof/>
-                <w:webHidden/>
-              </w:rPr>
-              <w:instrText xml:space="preserve"> PAGEREF _Toc219843023 \h </w:instrText>
-            </w:r>
-            <w:r>
-              <w:rPr>
-                <w:noProof/>
-                <w:webHidden/>
-              </w:rPr>
-            </w:r>
-            <w:r>
-              <w:rPr>
-                <w:noProof/>
-                <w:webHidden/>
-              </w:rPr>
-              <w:fldChar w:fldCharType="separate"/>
-            </w:r>
-            <w:r>
-              <w:rPr>
-                <w:noProof/>
-                <w:webHidden/>
-              </w:rPr>
-              <w:t>21</w:t>
-            </w:r>
-            <w:r>
-              <w:rPr>
-                <w:noProof/>
-                <w:webHidden/>
-              </w:rPr>
-              <w:fldChar w:fldCharType="end"/>
-            </w:r>
-          </w:hyperlink>
-        </w:p>
-        <w:p>
-          <w:pPr>
-            <w:pStyle w:val="Sumrio2"/>
-            <w:tabs>
-              <w:tab w:val="left" w:pos="720"/>
-              <w:tab w:val="right" w:leader="dot" w:pos="8494"/>
-            </w:tabs>
-            <w:rPr>
-              <w:rFonts w:eastAsiaTheme="minorEastAsia"/>
-              <w:noProof/>
-              <w:lang w:eastAsia="pt-BR"/>
-            </w:rPr>
-          </w:pPr>
-          <w:hyperlink w:anchor="_Toc219843024" w:history="1">
-            <w:r>
-              <w:rPr>
-                <w:rStyle w:val="Hyperlink"/>
-                <w:noProof/>
-              </w:rPr>
-              <w:t>3.</w:t>
-            </w:r>
-            <w:r>
-              <w:rPr>
-                <w:rFonts w:eastAsiaTheme="minorEastAsia"/>
-                <w:noProof/>
-                <w:lang w:eastAsia="pt-BR"/>
-              </w:rPr>
-              <w:tab/>
-            </w:r>
-            <w:r>
-              <w:rPr>
-                <w:rStyle w:val="Hyperlink"/>
-                <w:noProof/>
-              </w:rPr>
-              <w:t>Preparação dos dados para os Modelos</w:t>
-            </w:r>
-            <w:r>
-              <w:rPr>
-                <w:noProof/>
-                <w:webHidden/>
-              </w:rPr>
-              <w:tab/>
-            </w:r>
-            <w:r>
-              <w:rPr>
-                <w:noProof/>
-                <w:webHidden/>
-              </w:rPr>
-              <w:fldChar w:fldCharType="begin"/>
-            </w:r>
-            <w:r>
-              <w:rPr>
-                <w:noProof/>
-                <w:webHidden/>
-              </w:rPr>
-              <w:instrText xml:space="preserve"> PAGEREF _Toc219843024 \h </w:instrText>
-            </w:r>
-            <w:r>
-              <w:rPr>
-                <w:noProof/>
-                <w:webHidden/>
-              </w:rPr>
-            </w:r>
-            <w:r>
-              <w:rPr>
-                <w:noProof/>
-                <w:webHidden/>
-              </w:rPr>
-              <w:fldChar w:fldCharType="separate"/>
-            </w:r>
-            <w:r>
-              <w:rPr>
-                <w:noProof/>
-                <w:webHidden/>
-              </w:rPr>
-              <w:t>24</w:t>
-            </w:r>
-            <w:r>
-              <w:rPr>
-                <w:noProof/>
-                <w:webHidden/>
-              </w:rPr>
-              <w:fldChar w:fldCharType="end"/>
-            </w:r>
-          </w:hyperlink>
-        </w:p>
-        <w:p>
-          <w:pPr>
-            <w:pStyle w:val="Sumrio2"/>
-            <w:tabs>
-              <w:tab w:val="left" w:pos="720"/>
-              <w:tab w:val="right" w:leader="dot" w:pos="8494"/>
-            </w:tabs>
-            <w:rPr>
-              <w:rFonts w:eastAsiaTheme="minorEastAsia"/>
-              <w:noProof/>
-              <w:lang w:eastAsia="pt-BR"/>
-            </w:rPr>
-          </w:pPr>
-          <w:hyperlink w:anchor="_Toc219843025" w:history="1">
-            <w:r>
-              <w:rPr>
-                <w:rStyle w:val="Hyperlink"/>
-                <w:noProof/>
-              </w:rPr>
-              <w:t>4.</w:t>
-            </w:r>
-            <w:r>
-              <w:rPr>
-                <w:rFonts w:eastAsiaTheme="minorEastAsia"/>
-                <w:noProof/>
-                <w:lang w:eastAsia="pt-BR"/>
-              </w:rPr>
-              <w:tab/>
-            </w:r>
-            <w:r>
-              <w:rPr>
-                <w:rStyle w:val="Hyperlink"/>
-                <w:noProof/>
-              </w:rPr>
-              <w:t>Análise dos Modelos</w:t>
-            </w:r>
-            <w:r>
-              <w:rPr>
-                <w:noProof/>
-                <w:webHidden/>
-              </w:rPr>
-              <w:tab/>
-            </w:r>
-            <w:r>
-              <w:rPr>
-                <w:noProof/>
-                <w:webHidden/>
-              </w:rPr>
-              <w:fldChar w:fldCharType="begin"/>
-            </w:r>
-            <w:r>
-              <w:rPr>
-                <w:noProof/>
-                <w:webHidden/>
-              </w:rPr>
-              <w:instrText xml:space="preserve"> PAGEREF _Toc219843025 \h </w:instrText>
-            </w:r>
-            <w:r>
-              <w:rPr>
-                <w:noProof/>
-                <w:webHidden/>
-              </w:rPr>
-            </w:r>
-            <w:r>
-              <w:rPr>
-                <w:noProof/>
-                <w:webHidden/>
-              </w:rPr>
-              <w:fldChar w:fldCharType="separate"/>
-            </w:r>
-            <w:r>
-              <w:rPr>
-                <w:noProof/>
-                <w:webHidden/>
-              </w:rPr>
-              <w:t>26</w:t>
-            </w:r>
-            <w:r>
-              <w:rPr>
-                <w:noProof/>
-                <w:webHidden/>
-              </w:rPr>
-              <w:fldChar w:fldCharType="end"/>
-            </w:r>
-          </w:hyperlink>
-        </w:p>
-        <w:p>
-          <w:pPr>
-            <w:pStyle w:val="Sumrio3"/>
-            <w:tabs>
-              <w:tab w:val="right" w:leader="dot" w:pos="8494"/>
-            </w:tabs>
-            <w:rPr>
-              <w:rFonts w:eastAsiaTheme="minorEastAsia"/>
-              <w:noProof/>
-              <w:lang w:eastAsia="pt-BR"/>
-            </w:rPr>
-          </w:pPr>
-          <w:hyperlink w:anchor="_Toc219843026" w:history="1">
-            <w:r>
-              <w:rPr>
-                <w:rStyle w:val="Hyperlink"/>
-                <w:noProof/>
-                <w:lang w:val="en-US"/>
-              </w:rPr>
-              <w:t>RANDOM FOREST</w:t>
-            </w:r>
-            <w:r>
-              <w:rPr>
-                <w:noProof/>
-                <w:webHidden/>
-              </w:rPr>
-              <w:tab/>
-            </w:r>
-            <w:r>
-              <w:rPr>
-                <w:noProof/>
-                <w:webHidden/>
-              </w:rPr>
-              <w:fldChar w:fldCharType="begin"/>
-            </w:r>
-            <w:r>
-              <w:rPr>
-                <w:noProof/>
-                <w:webHidden/>
-              </w:rPr>
-              <w:instrText xml:space="preserve"> PAGEREF _Toc219843026 \h </w:instrText>
-            </w:r>
-            <w:r>
-              <w:rPr>
-                <w:noProof/>
-                <w:webHidden/>
-              </w:rPr>
-            </w:r>
-            <w:r>
-              <w:rPr>
-                <w:noProof/>
-                <w:webHidden/>
-              </w:rPr>
-              <w:fldChar w:fldCharType="separate"/>
-            </w:r>
-            <w:r>
-              <w:rPr>
-                <w:noProof/>
-                <w:webHidden/>
-              </w:rPr>
-              <w:t>27</w:t>
-            </w:r>
-            <w:r>
-              <w:rPr>
-                <w:noProof/>
-                <w:webHidden/>
-              </w:rPr>
-              <w:fldChar w:fldCharType="end"/>
-            </w:r>
-          </w:hyperlink>
-        </w:p>
-        <w:p>
-          <w:pPr>
-            <w:pStyle w:val="Sumrio3"/>
-            <w:tabs>
-              <w:tab w:val="right" w:leader="dot" w:pos="8494"/>
-            </w:tabs>
-            <w:rPr>
-              <w:rFonts w:eastAsiaTheme="minorEastAsia"/>
-              <w:noProof/>
-              <w:lang w:eastAsia="pt-BR"/>
-            </w:rPr>
-          </w:pPr>
-          <w:hyperlink w:anchor="_Toc219843027" w:history="1">
-            <w:r>
-              <w:rPr>
-                <w:rStyle w:val="Hyperlink"/>
-                <w:noProof/>
-              </w:rPr>
-              <w:t>K-Nearest Neighbors (KNN)</w:t>
-            </w:r>
-            <w:r>
-              <w:rPr>
-                <w:noProof/>
-                <w:webHidden/>
-              </w:rPr>
-              <w:tab/>
-            </w:r>
-            <w:r>
-              <w:rPr>
-                <w:noProof/>
-                <w:webHidden/>
-              </w:rPr>
-              <w:fldChar w:fldCharType="begin"/>
-            </w:r>
-            <w:r>
-              <w:rPr>
-                <w:noProof/>
-                <w:webHidden/>
-              </w:rPr>
-              <w:instrText xml:space="preserve"> PAGEREF _Toc219843027 \h </w:instrText>
-            </w:r>
-            <w:r>
-              <w:rPr>
-                <w:noProof/>
-                <w:webHidden/>
-              </w:rPr>
-            </w:r>
-            <w:r>
-              <w:rPr>
-                <w:noProof/>
-                <w:webHidden/>
-              </w:rPr>
-              <w:fldChar w:fldCharType="separate"/>
-            </w:r>
-            <w:r>
-              <w:rPr>
-                <w:noProof/>
-                <w:webHidden/>
-              </w:rPr>
-              <w:t>30</w:t>
-            </w:r>
-            <w:r>
-              <w:rPr>
-                <w:noProof/>
-                <w:webHidden/>
-              </w:rPr>
-              <w:fldChar w:fldCharType="end"/>
-            </w:r>
-          </w:hyperlink>
-        </w:p>
-        <w:p>
-          <w:pPr>
-            <w:pStyle w:val="Sumrio3"/>
-            <w:tabs>
-              <w:tab w:val="right" w:leader="dot" w:pos="8494"/>
-            </w:tabs>
-            <w:rPr>
-              <w:rFonts w:eastAsiaTheme="minorEastAsia"/>
-              <w:noProof/>
-              <w:lang w:eastAsia="pt-BR"/>
-            </w:rPr>
-          </w:pPr>
-          <w:hyperlink w:anchor="_Toc219843028" w:history="1">
-            <w:r>
-              <w:rPr>
-                <w:rStyle w:val="Hyperlink"/>
-                <w:noProof/>
-              </w:rPr>
-              <w:t>SUPPORT VECTOR MACHINE (SVM)</w:t>
-            </w:r>
-            <w:r>
-              <w:rPr>
-                <w:noProof/>
-                <w:webHidden/>
-              </w:rPr>
-              <w:tab/>
-            </w:r>
-            <w:r>
-              <w:rPr>
-                <w:noProof/>
-                <w:webHidden/>
-              </w:rPr>
-              <w:fldChar w:fldCharType="begin"/>
-            </w:r>
-            <w:r>
-              <w:rPr>
-                <w:noProof/>
-                <w:webHidden/>
-              </w:rPr>
-              <w:instrText xml:space="preserve"> PAGEREF _Toc219843028 \h </w:instrText>
-            </w:r>
-            <w:r>
-              <w:rPr>
-                <w:noProof/>
-                <w:webHidden/>
-              </w:rPr>
-            </w:r>
-            <w:r>
-              <w:rPr>
-                <w:noProof/>
-                <w:webHidden/>
-              </w:rPr>
-              <w:fldChar w:fldCharType="separate"/>
-            </w:r>
-            <w:r>
-              <w:rPr>
-                <w:noProof/>
-                <w:webHidden/>
-              </w:rPr>
-              <w:t>32</w:t>
-            </w:r>
-            <w:r>
-              <w:rPr>
-                <w:noProof/>
-                <w:webHidden/>
-              </w:rPr>
-              <w:fldChar w:fldCharType="end"/>
-            </w:r>
-          </w:hyperlink>
-        </w:p>
-        <w:p>
-          <w:pPr>
-            <w:pStyle w:val="Sumrio2"/>
-            <w:tabs>
-              <w:tab w:val="left" w:pos="720"/>
-              <w:tab w:val="right" w:leader="dot" w:pos="8494"/>
-            </w:tabs>
-            <w:rPr>
-              <w:rFonts w:eastAsiaTheme="minorEastAsia"/>
-              <w:noProof/>
-              <w:lang w:eastAsia="pt-BR"/>
-            </w:rPr>
-          </w:pPr>
-          <w:hyperlink w:anchor="_Toc219843029" w:history="1">
-            <w:r>
-              <w:rPr>
-                <w:rStyle w:val="Hyperlink"/>
-                <w:noProof/>
-              </w:rPr>
-              <w:t>5.</w:t>
-            </w:r>
-            <w:r>
-              <w:rPr>
-                <w:rFonts w:eastAsiaTheme="minorEastAsia"/>
-                <w:noProof/>
-                <w:lang w:eastAsia="pt-BR"/>
-              </w:rPr>
-              <w:tab/>
-            </w:r>
-            <w:r>
-              <w:rPr>
-                <w:rStyle w:val="Hyperlink"/>
-                <w:noProof/>
-              </w:rPr>
-              <w:t>Avaliação dos Modelos</w:t>
-            </w:r>
-            <w:r>
-              <w:rPr>
-                <w:noProof/>
-                <w:webHidden/>
-              </w:rPr>
-              <w:tab/>
-            </w:r>
-            <w:r>
-              <w:rPr>
-                <w:noProof/>
-                <w:webHidden/>
-              </w:rPr>
-              <w:fldChar w:fldCharType="begin"/>
-            </w:r>
-            <w:r>
-              <w:rPr>
-                <w:noProof/>
-                <w:webHidden/>
-              </w:rPr>
-              <w:instrText xml:space="preserve"> PAGEREF _Toc219843029 \h </w:instrText>
-            </w:r>
-            <w:r>
-              <w:rPr>
-                <w:noProof/>
-                <w:webHidden/>
-              </w:rPr>
-            </w:r>
-            <w:r>
-              <w:rPr>
-                <w:noProof/>
-                <w:webHidden/>
-              </w:rPr>
-              <w:fldChar w:fldCharType="separate"/>
-            </w:r>
-            <w:r>
-              <w:rPr>
-                <w:noProof/>
-                <w:webHidden/>
-              </w:rPr>
-              <w:t>34</w:t>
-            </w:r>
-            <w:r>
-              <w:rPr>
-                <w:noProof/>
-                <w:webHidden/>
-              </w:rPr>
-              <w:fldChar w:fldCharType="end"/>
-            </w:r>
-          </w:hyperlink>
-        </w:p>
-        <w:p>
-          <w:pPr>
-            <w:pStyle w:val="Sumrio2"/>
-            <w:tabs>
-              <w:tab w:val="right" w:leader="dot" w:pos="8494"/>
-            </w:tabs>
-            <w:rPr>
-              <w:rFonts w:eastAsiaTheme="minorEastAsia"/>
-              <w:noProof/>
-              <w:lang w:eastAsia="pt-BR"/>
-            </w:rPr>
-          </w:pPr>
-          <w:hyperlink w:anchor="_Toc219843030" w:history="1">
-            <w:r>
-              <w:rPr>
-                <w:rStyle w:val="Hyperlink"/>
-                <w:noProof/>
-              </w:rPr>
-              <w:t>Validação Cruzada</w:t>
-            </w:r>
-            <w:r>
-              <w:rPr>
-                <w:noProof/>
-                <w:webHidden/>
-              </w:rPr>
-              <w:tab/>
-            </w:r>
-            <w:r>
-              <w:rPr>
-                <w:noProof/>
-                <w:webHidden/>
-              </w:rPr>
-              <w:fldChar w:fldCharType="begin"/>
-            </w:r>
-            <w:r>
-              <w:rPr>
-                <w:noProof/>
-                <w:webHidden/>
-              </w:rPr>
-              <w:instrText xml:space="preserve"> PAGEREF _Toc219843030 \h </w:instrText>
-            </w:r>
-            <w:r>
-              <w:rPr>
-                <w:noProof/>
-                <w:webHidden/>
-              </w:rPr>
-            </w:r>
-            <w:r>
-              <w:rPr>
-                <w:noProof/>
-                <w:webHidden/>
-              </w:rPr>
-              <w:fldChar w:fldCharType="separate"/>
-            </w:r>
-            <w:r>
-              <w:rPr>
-                <w:noProof/>
-                <w:webHidden/>
-              </w:rPr>
-              <w:t>34</w:t>
-            </w:r>
-            <w:r>
-              <w:rPr>
-                <w:noProof/>
-                <w:webHidden/>
-              </w:rPr>
-              <w:fldChar w:fldCharType="end"/>
-            </w:r>
-          </w:hyperlink>
-        </w:p>
-        <w:p>
-          <w:pPr>
-            <w:pStyle w:val="Sumrio2"/>
-            <w:tabs>
-              <w:tab w:val="right" w:leader="dot" w:pos="8494"/>
-            </w:tabs>
-            <w:rPr>
-              <w:rFonts w:eastAsiaTheme="minorEastAsia"/>
-              <w:noProof/>
-              <w:lang w:eastAsia="pt-BR"/>
-            </w:rPr>
-          </w:pPr>
-          <w:hyperlink w:anchor="_Toc219843031" w:history="1">
-            <w:r>
-              <w:rPr>
-                <w:rStyle w:val="Hyperlink"/>
-                <w:noProof/>
-              </w:rPr>
-              <w:t>Matriz de confusão</w:t>
-            </w:r>
-            <w:r>
-              <w:rPr>
-                <w:noProof/>
-                <w:webHidden/>
-              </w:rPr>
-              <w:tab/>
-            </w:r>
-            <w:r>
-              <w:rPr>
-                <w:noProof/>
-                <w:webHidden/>
-              </w:rPr>
-              <w:fldChar w:fldCharType="begin"/>
-            </w:r>
-            <w:r>
-              <w:rPr>
-                <w:noProof/>
-                <w:webHidden/>
-              </w:rPr>
-              <w:instrText xml:space="preserve"> PAGEREF _Toc219843031 \h </w:instrText>
-            </w:r>
-            <w:r>
-              <w:rPr>
-                <w:noProof/>
-                <w:webHidden/>
-              </w:rPr>
-            </w:r>
-            <w:r>
-              <w:rPr>
-                <w:noProof/>
-                <w:webHidden/>
-              </w:rPr>
-              <w:fldChar w:fldCharType="separate"/>
-            </w:r>
-            <w:r>
-              <w:rPr>
-                <w:noProof/>
-                <w:webHidden/>
-              </w:rPr>
-              <w:t>35</w:t>
-            </w:r>
-            <w:r>
-              <w:rPr>
-                <w:noProof/>
-                <w:webHidden/>
-              </w:rPr>
-              <w:fldChar w:fldCharType="end"/>
-            </w:r>
-          </w:hyperlink>
-        </w:p>
-        <w:p>
-          <w:pPr>
-            <w:pStyle w:val="Sumrio3"/>
-            <w:tabs>
-              <w:tab w:val="right" w:leader="dot" w:pos="8494"/>
-            </w:tabs>
-            <w:rPr>
-              <w:rFonts w:eastAsiaTheme="minorEastAsia"/>
-              <w:noProof/>
-              <w:lang w:eastAsia="pt-BR"/>
-            </w:rPr>
-          </w:pPr>
-          <w:hyperlink w:anchor="_Toc219843032" w:history="1">
-            <w:r>
-              <w:rPr>
-                <w:rStyle w:val="Hyperlink"/>
-                <w:noProof/>
-                <w:lang w:val="en-US"/>
-              </w:rPr>
-              <w:t>Random Forest</w:t>
-            </w:r>
-            <w:r>
-              <w:rPr>
-                <w:noProof/>
-                <w:webHidden/>
-              </w:rPr>
-              <w:tab/>
-            </w:r>
-            <w:r>
-              <w:rPr>
-                <w:noProof/>
-                <w:webHidden/>
-              </w:rPr>
-              <w:fldChar w:fldCharType="begin"/>
-            </w:r>
-            <w:r>
-              <w:rPr>
-                <w:noProof/>
-                <w:webHidden/>
-              </w:rPr>
-              <w:instrText xml:space="preserve"> PAGEREF _Toc219843032 \h </w:instrText>
-            </w:r>
-            <w:r>
-              <w:rPr>
-                <w:noProof/>
-                <w:webHidden/>
-              </w:rPr>
-            </w:r>
-            <w:r>
-              <w:rPr>
-                <w:noProof/>
-                <w:webHidden/>
-              </w:rPr>
-              <w:fldChar w:fldCharType="separate"/>
-            </w:r>
-            <w:r>
-              <w:rPr>
-                <w:noProof/>
-                <w:webHidden/>
-              </w:rPr>
-              <w:t>35</w:t>
-            </w:r>
-            <w:r>
-              <w:rPr>
-                <w:noProof/>
-                <w:webHidden/>
-              </w:rPr>
-              <w:fldChar w:fldCharType="end"/>
-            </w:r>
-          </w:hyperlink>
-        </w:p>
-        <w:p>
-          <w:pPr>
-            <w:pStyle w:val="Sumrio3"/>
-            <w:tabs>
-              <w:tab w:val="right" w:leader="dot" w:pos="8494"/>
-            </w:tabs>
-            <w:rPr>
-              <w:rFonts w:eastAsiaTheme="minorEastAsia"/>
-              <w:noProof/>
-              <w:lang w:eastAsia="pt-BR"/>
-            </w:rPr>
-          </w:pPr>
-          <w:hyperlink w:anchor="_Toc219843033" w:history="1">
-            <w:r>
-              <w:rPr>
-                <w:rStyle w:val="Hyperlink"/>
-                <w:noProof/>
-              </w:rPr>
-              <w:t>KNN</w:t>
-            </w:r>
-            <w:r>
-              <w:rPr>
-                <w:noProof/>
-                <w:webHidden/>
-              </w:rPr>
-              <w:tab/>
-            </w:r>
-            <w:r>
-              <w:rPr>
-                <w:noProof/>
-                <w:webHidden/>
-              </w:rPr>
-              <w:fldChar w:fldCharType="begin"/>
-            </w:r>
-            <w:r>
-              <w:rPr>
-                <w:noProof/>
-                <w:webHidden/>
-              </w:rPr>
-              <w:instrText xml:space="preserve"> PAGEREF _Toc219843033 \h </w:instrText>
-            </w:r>
-            <w:r>
-              <w:rPr>
-                <w:noProof/>
-                <w:webHidden/>
-              </w:rPr>
-            </w:r>
-            <w:r>
-              <w:rPr>
-                <w:noProof/>
-                <w:webHidden/>
-              </w:rPr>
-              <w:fldChar w:fldCharType="separate"/>
-            </w:r>
-            <w:r>
-              <w:rPr>
-                <w:noProof/>
-                <w:webHidden/>
-              </w:rPr>
-              <w:t>36</w:t>
-            </w:r>
-            <w:r>
-              <w:rPr>
-                <w:noProof/>
-                <w:webHidden/>
-              </w:rPr>
-              <w:fldChar w:fldCharType="end"/>
-            </w:r>
-          </w:hyperlink>
-        </w:p>
-        <w:p>
-          <w:pPr>
-            <w:pStyle w:val="Sumrio3"/>
-            <w:tabs>
-              <w:tab w:val="right" w:leader="dot" w:pos="8494"/>
-            </w:tabs>
-            <w:rPr>
-              <w:rFonts w:eastAsiaTheme="minorEastAsia"/>
-              <w:noProof/>
-              <w:lang w:eastAsia="pt-BR"/>
-            </w:rPr>
-          </w:pPr>
-          <w:hyperlink w:anchor="_Toc219843034" w:history="1">
-            <w:r>
-              <w:rPr>
-                <w:rStyle w:val="Hyperlink"/>
-                <w:noProof/>
-              </w:rPr>
-              <w:t>SVM</w:t>
-            </w:r>
-            <w:r>
-              <w:rPr>
-                <w:noProof/>
-                <w:webHidden/>
-              </w:rPr>
-              <w:tab/>
-            </w:r>
-            <w:r>
-              <w:rPr>
-                <w:noProof/>
-                <w:webHidden/>
-              </w:rPr>
-              <w:fldChar w:fldCharType="begin"/>
-            </w:r>
-            <w:r>
-              <w:rPr>
-                <w:noProof/>
-                <w:webHidden/>
-              </w:rPr>
-              <w:instrText xml:space="preserve"> PAGEREF _Toc219843034 \h </w:instrText>
-            </w:r>
-            <w:r>
-              <w:rPr>
-                <w:noProof/>
-                <w:webHidden/>
-              </w:rPr>
-            </w:r>
-            <w:r>
-              <w:rPr>
-                <w:noProof/>
-                <w:webHidden/>
-              </w:rPr>
-              <w:fldChar w:fldCharType="separate"/>
-            </w:r>
-            <w:r>
-              <w:rPr>
-                <w:noProof/>
-                <w:webHidden/>
-              </w:rPr>
-              <w:t>38</w:t>
-            </w:r>
-            <w:r>
-              <w:rPr>
-                <w:noProof/>
-                <w:webHidden/>
-              </w:rPr>
-              <w:fldChar w:fldCharType="end"/>
-            </w:r>
-          </w:hyperlink>
-        </w:p>
-        <w:p>
-          <w:pPr>
-            <w:pStyle w:val="Sumrio2"/>
-            <w:tabs>
-              <w:tab w:val="left" w:pos="720"/>
-              <w:tab w:val="right" w:leader="dot" w:pos="8494"/>
-            </w:tabs>
-            <w:rPr>
-              <w:rFonts w:eastAsiaTheme="minorEastAsia"/>
-              <w:noProof/>
-              <w:lang w:eastAsia="pt-BR"/>
-            </w:rPr>
-          </w:pPr>
-          <w:hyperlink w:anchor="_Toc219843035" w:history="1">
-            <w:r>
-              <w:rPr>
-                <w:rStyle w:val="Hyperlink"/>
-                <w:noProof/>
-              </w:rPr>
-              <w:t>6.</w:t>
-            </w:r>
-            <w:r>
-              <w:rPr>
-                <w:rFonts w:eastAsiaTheme="minorEastAsia"/>
-                <w:noProof/>
-                <w:lang w:eastAsia="pt-BR"/>
-              </w:rPr>
-              <w:tab/>
-            </w:r>
-            <w:r>
-              <w:rPr>
-                <w:rStyle w:val="Hyperlink"/>
-                <w:noProof/>
-              </w:rPr>
-              <w:t>Teste do Melhor Modelo</w:t>
-            </w:r>
-            <w:r>
-              <w:rPr>
-                <w:noProof/>
-                <w:webHidden/>
-              </w:rPr>
-              <w:tab/>
-            </w:r>
-            <w:r>
-              <w:rPr>
-                <w:noProof/>
-                <w:webHidden/>
-              </w:rPr>
-              <w:fldChar w:fldCharType="begin"/>
-            </w:r>
-            <w:r>
-              <w:rPr>
-                <w:noProof/>
-                <w:webHidden/>
-              </w:rPr>
-              <w:instrText xml:space="preserve"> PAGEREF _Toc219843035 \h </w:instrText>
-            </w:r>
-            <w:r>
-              <w:rPr>
-                <w:noProof/>
-                <w:webHidden/>
-              </w:rPr>
-            </w:r>
-            <w:r>
-              <w:rPr>
-                <w:noProof/>
-                <w:webHidden/>
-              </w:rPr>
-              <w:fldChar w:fldCharType="separate"/>
-            </w:r>
-            <w:r>
-              <w:rPr>
-                <w:noProof/>
-                <w:webHidden/>
-              </w:rPr>
-              <w:t>40</w:t>
+              <w:t>6</w:t>
             </w:r>
             <w:r>
               <w:rPr>
@@ -2395,7 +897,6 @@
     </w:sdt>
     <w:p>
       <w:r>
-        <w:lastRenderedPageBreak/>
         <w:br w:type="page"/>
       </w:r>
     </w:p>
@@ -2403,7 +904,7 @@
       <w:pPr>
         <w:pStyle w:val="Ttulo1"/>
       </w:pPr>
-      <w:bookmarkStart w:id="0" w:name="_Toc219843008"/>
+      <w:bookmarkStart w:id="0" w:name="_Toc221432116"/>
       <w:r>
         <w:lastRenderedPageBreak/>
         <w:t>Introdução</w:t>
@@ -2624,7 +1125,7 @@
       <w:pPr>
         <w:pStyle w:val="Ttulo1"/>
       </w:pPr>
-      <w:bookmarkStart w:id="1" w:name="_Toc219843009"/>
+      <w:bookmarkStart w:id="1" w:name="_Toc221432117"/>
       <w:r>
         <w:t>Montagem do ambiente</w:t>
       </w:r>
@@ -2640,7 +1141,7 @@
       <w:pPr>
         <w:pStyle w:val="Ttulo2"/>
       </w:pPr>
-      <w:bookmarkStart w:id="2" w:name="_Toc219843010"/>
+      <w:bookmarkStart w:id="2" w:name="_Toc221432118"/>
       <w:r>
         <w:t>OB Studio</w:t>
       </w:r>
@@ -2669,7 +1170,7 @@
       <w:pPr>
         <w:pStyle w:val="Ttulo2"/>
       </w:pPr>
-      <w:bookmarkStart w:id="3" w:name="_Toc219843011"/>
+      <w:bookmarkStart w:id="3" w:name="_Toc221432119"/>
       <w:r>
         <w:t>Ambiente Python</w:t>
       </w:r>
@@ -2770,7 +1271,7 @@
           <v:shape id="_x0000_i1026" type="#_x0000_t75" style="width:78pt;height:48pt" o:ole="">
             <v:imagedata r:id="rId11" o:title=""/>
           </v:shape>
-          <o:OLEObject Type="Embed" ProgID="Word.Document.12" ShapeID="_x0000_i1026" DrawAspect="Icon" ObjectID="_1832044659" r:id="rId12">
+          <o:OLEObject Type="Embed" ProgID="Word.Document.12" ShapeID="_x0000_i1026" DrawAspect="Icon" ObjectID="_1832727876" r:id="rId12">
             <o:FieldCodes>\s</o:FieldCodes>
           </o:OLEObject>
         </w:object>
@@ -2781,7 +1282,89 @@
         <w:pStyle w:val="Ttulo4"/>
       </w:pPr>
       <w:r>
+        <w:t>PYTHON</w:t>
+      </w:r>
+    </w:p>
+    <w:p>
+      <w:r>
+        <w:t>Versão: 3.</w:t>
+      </w:r>
+      <w:r>
+        <w:t>13</w:t>
+      </w:r>
+      <w:r>
+        <w:t>.</w:t>
+      </w:r>
+      <w:r>
+        <w:t>0</w:t>
+      </w:r>
+      <w:r>
+        <w:t xml:space="preserve"> </w:t>
+      </w:r>
+      <w:r>
+        <w:sym w:font="Wingdings" w:char="F0E0"/>
+      </w:r>
+      <w:r>
+        <w:t xml:space="preserve"> </w:t>
+      </w:r>
+    </w:p>
+    <w:p>
+      <w:pPr>
+        <w:pStyle w:val="Ttulo4"/>
+      </w:pPr>
+      <w:r>
         <w:t>Bibliotecas PYTHON</w:t>
+      </w:r>
+    </w:p>
+    <w:p>
+      <w:pPr>
+        <w:pStyle w:val="PargrafodaLista"/>
+        <w:numPr>
+          <w:ilvl w:val="0"/>
+          <w:numId w:val="28"/>
+        </w:numPr>
+        <w:rPr>
+          <w:i/>
+          <w:iCs/>
+          <w:color w:val="404040" w:themeColor="text1" w:themeTint="BF"/>
+        </w:rPr>
+      </w:pPr>
+      <w:r>
+        <w:rPr>
+          <w:rStyle w:val="nfaseSutil"/>
+        </w:rPr>
+        <w:t>m</w:t>
+      </w:r>
+      <w:r>
+        <w:rPr>
+          <w:rStyle w:val="nfaseSutil"/>
+        </w:rPr>
+        <w:t>ypy</w:t>
+      </w:r>
+      <w:r>
+        <w:rPr>
+          <w:rStyle w:val="nfaseSutil"/>
+          <w:i w:val="0"/>
+          <w:iCs w:val="0"/>
+        </w:rPr>
+        <w:t xml:space="preserve"> :</w:t>
+      </w:r>
+      <w:r>
+        <w:rPr>
+          <w:rStyle w:val="nfaseSutil"/>
+          <w:i w:val="0"/>
+          <w:iCs w:val="0"/>
+        </w:rPr>
+        <w:t xml:space="preserve"> </w:t>
+      </w:r>
+      <w:r>
+        <w:t xml:space="preserve">verifica os </w:t>
+      </w:r>
+      <w:r>
+        <w:t xml:space="preserve">type hints, </w:t>
+      </w:r>
+      <w:r>
+        <w:t>capaz de detectar muitos erros de programação analisando seu programa, sem precisar executá-lo. O mypy possui um sistema de tipos robusto com recursos como inferência de tipos, tipagem gradual, genéricos e tipos de união.</w:t>
       </w:r>
     </w:p>
     <w:p>
@@ -2799,7 +1382,76 @@
         <w:rPr>
           <w:rStyle w:val="nfaseSutil"/>
         </w:rPr>
-        <w:t>XXXX</w:t>
+        <w:t>Pandas:</w:t>
+      </w:r>
+      <w:r>
+        <w:rPr>
+          <w:rStyle w:val="nfaseSutil"/>
+          <w:i w:val="0"/>
+          <w:iCs w:val="0"/>
+        </w:rPr>
+        <w:t xml:space="preserve"> </w:t>
+      </w:r>
+      <w:r>
+        <w:t xml:space="preserve">2.2.2. </w:t>
+      </w:r>
+      <w:r>
+        <w:t xml:space="preserve">(versão do </w:t>
+      </w:r>
+      <w:r>
+        <w:t>Google Colab</w:t>
+      </w:r>
+      <w:r>
+        <w:t>(</w:t>
+      </w:r>
+      <w:r>
+        <w:drawing>
+          <wp:inline distT="0" distB="0" distL="0" distR="0" wp14:anchorId="42B97DE2" wp14:editId="611F2908">
+            <wp:extent cx="323895" cy="228632"/>
+            <wp:effectExtent l="0" t="0" r="0" b="0"/>
+            <wp:docPr id="1339844630" name="Imagem 1"/>
+            <wp:cNvGraphicFramePr>
+              <a:graphicFrameLocks xmlns:a="http://schemas.openxmlformats.org/drawingml/2006/main" noChangeAspect="1"/>
+            </wp:cNvGraphicFramePr>
+            <a:graphic xmlns:a="http://schemas.openxmlformats.org/drawingml/2006/main">
+              <a:graphicData uri="http://schemas.openxmlformats.org/drawingml/2006/picture">
+                <pic:pic xmlns:pic="http://schemas.openxmlformats.org/drawingml/2006/picture">
+                  <pic:nvPicPr>
+                    <pic:cNvPr id="172723442" name=""/>
+                    <pic:cNvPicPr/>
+                  </pic:nvPicPr>
+                  <pic:blipFill>
+                    <a:blip r:embed="rId13"/>
+                    <a:stretch>
+                      <a:fillRect/>
+                    </a:stretch>
+                  </pic:blipFill>
+                  <pic:spPr>
+                    <a:xfrm>
+                      <a:off x="0" y="0"/>
+                      <a:ext cx="323895" cy="228632"/>
+                    </a:xfrm>
+                    <a:prstGeom prst="rect">
+                      <a:avLst/>
+                    </a:prstGeom>
+                  </pic:spPr>
+                </pic:pic>
+              </a:graphicData>
+            </a:graphic>
+          </wp:inline>
+        </w:drawing>
+      </w:r>
+      <w:r>
+        <w:t>)</w:t>
+      </w:r>
+      <w:r>
+        <w:t xml:space="preserve"> </w:t>
+      </w:r>
+      <w:r>
+        <w:sym w:font="Wingdings" w:char="F0E0"/>
+      </w:r>
+      <w:r>
+        <w:t xml:space="preserve"> 2.2.2</w:t>
       </w:r>
     </w:p>
     <w:p>
@@ -2815,14 +1467,14 @@
       <w:pPr>
         <w:pStyle w:val="Ttulo2"/>
       </w:pPr>
-      <w:bookmarkStart w:id="5" w:name="_Toc219843012"/>
+      <w:bookmarkStart w:id="5" w:name="_Toc221432120"/>
       <w:r>
         <w:t xml:space="preserve">Extensões do </w:t>
       </w:r>
+      <w:r>
+        <w:t>CURSOR</w:t>
+      </w:r>
       <w:bookmarkEnd w:id="5"/>
-      <w:r>
-        <w:t>CURSOR</w:t>
-      </w:r>
     </w:p>
     <w:p>
       <w:pPr>
@@ -2832,7 +1484,7 @@
         </w:numPr>
       </w:pPr>
       <w:r>
-        <w:t>Autopep8</w:t>
+        <w:t>Todo Tree</w:t>
       </w:r>
     </w:p>
     <w:p>
@@ -2843,7 +1495,7 @@
         </w:numPr>
       </w:pPr>
       <w:r>
-        <w:t>JSON</w:t>
+        <w:t>Autopep8</w:t>
       </w:r>
     </w:p>
     <w:p>
@@ -2876,6 +1528,7 @@
         </w:numPr>
       </w:pPr>
       <w:r>
+        <w:lastRenderedPageBreak/>
         <w:t>Pylace</w:t>
       </w:r>
     </w:p>
@@ -2909,18 +1562,6 @@
         </w:numPr>
       </w:pPr>
       <w:r>
-        <w:t>Python Environment</w:t>
-      </w:r>
-    </w:p>
-    <w:p>
-      <w:pPr>
-        <w:numPr>
-          <w:ilvl w:val="0"/>
-          <w:numId w:val="12"/>
-        </w:numPr>
-      </w:pPr>
-      <w:r>
-        <w:lastRenderedPageBreak/>
         <w:t>Rainbow CSV</w:t>
       </w:r>
     </w:p>
@@ -2929,14 +1570,14 @@
       <w:pPr>
         <w:pStyle w:val="Ttulo2"/>
       </w:pPr>
-      <w:bookmarkStart w:id="6" w:name="_Toc219843013"/>
+      <w:bookmarkStart w:id="6" w:name="_Toc221432121"/>
       <w:r>
         <w:t>Ambiente do GIT</w:t>
       </w:r>
       <w:bookmarkEnd w:id="6"/>
     </w:p>
     <w:p>
-      <w:hyperlink r:id="rId13" w:history="1">
+      <w:hyperlink r:id="rId14" w:history="1">
         <w:r>
           <w:rPr>
             <w:rStyle w:val="Hyperlink"/>
@@ -2945,12 +1586,146 @@
         </w:r>
       </w:hyperlink>
     </w:p>
+    <w:p/>
+    <w:p>
+      <w:pPr>
+        <w:pStyle w:val="Ttulo2"/>
+      </w:pPr>
+      <w:r>
+        <w:t>Ambiente do projeto Python</w:t>
+      </w:r>
+    </w:p>
+    <w:p>
+      <w:r>
+        <w:rPr>
+          <w:i/>
+          <w:iCs/>
+          <w:color w:val="EE0000"/>
+        </w:rPr>
+        <w:t>&lt;base&gt;</w:t>
+      </w:r>
+      <w:r>
+        <w:t xml:space="preserve"> </w:t>
+      </w:r>
+      <w:r>
+        <w:sym w:font="Wingdings" w:char="F0E0"/>
+      </w:r>
+      <w:r>
+        <w:t xml:space="preserve"> &lt;dir&gt;</w:t>
+      </w:r>
+      <w:r>
+        <w:t>\Tech-Challenge-FIAP-FASE2</w:t>
+      </w:r>
+      <w:r>
+        <w:t xml:space="preserve">: </w:t>
+      </w:r>
+      <w:r>
+        <w:t>diretório base d</w:t>
+      </w:r>
+      <w:r>
+        <w:t>o</w:t>
+      </w:r>
+      <w:r>
+        <w:t xml:space="preserve"> projeto</w:t>
+      </w:r>
+    </w:p>
+    <w:p>
+      <w:r>
+        <w:rPr>
+          <w:i/>
+          <w:iCs/>
+          <w:color w:val="EE0000"/>
+        </w:rPr>
+        <w:t>&lt;base&gt;</w:t>
+      </w:r>
+      <w:r>
+        <w:t>\</w:t>
+      </w:r>
+      <w:r>
+        <w:t>ag</w:t>
+      </w:r>
+      <w:r>
+        <w:t xml:space="preserve"> </w:t>
+      </w:r>
+      <w:r>
+        <w:sym w:font="Wingdings" w:char="F0E0"/>
+      </w:r>
+      <w:r>
+        <w:t xml:space="preserve"> contem os fontes</w:t>
+      </w:r>
+      <w:r>
+        <w:t xml:space="preserve"> principais</w:t>
+      </w:r>
+    </w:p>
+    <w:p>
+      <w:r>
+        <w:rPr>
+          <w:i/>
+          <w:iCs/>
+          <w:color w:val="EE0000"/>
+        </w:rPr>
+        <w:t>&lt;base&gt;</w:t>
+      </w:r>
+      <w:r>
+        <w:t>\</w:t>
+      </w:r>
+      <w:r>
+        <w:t>ag</w:t>
+      </w:r>
+      <w:r>
+        <w:t>\modelos --&gt; contém as classes</w:t>
+      </w:r>
+    </w:p>
+    <w:p>
+      <w:r>
+        <w:rPr>
+          <w:i/>
+          <w:iCs/>
+          <w:color w:val="EE0000"/>
+        </w:rPr>
+        <w:t>&lt;base&gt;</w:t>
+      </w:r>
+      <w:r>
+        <w:t>\docs</w:t>
+      </w:r>
+      <w:r>
+        <w:t xml:space="preserve"> </w:t>
+      </w:r>
+      <w:r>
+        <w:sym w:font="Wingdings" w:char="F0E0"/>
+      </w:r>
+      <w:r>
+        <w:t xml:space="preserve"> documentação do projeto</w:t>
+      </w:r>
+    </w:p>
+    <w:p>
+      <w:r>
+        <w:rPr>
+          <w:i/>
+          <w:iCs/>
+          <w:color w:val="EE0000"/>
+        </w:rPr>
+        <w:t>&lt;base&gt;</w:t>
+      </w:r>
+      <w:r>
+        <w:t>\tests</w:t>
+      </w:r>
+      <w:r>
+        <w:t xml:space="preserve"> </w:t>
+      </w:r>
+      <w:r>
+        <w:sym w:font="Wingdings" w:char="F0E0"/>
+      </w:r>
+      <w:r>
+        <w:t xml:space="preserve"> testes unitários</w:t>
+      </w:r>
+    </w:p>
+    <w:p/>
     <w:p>
       <w:r>
         <w:br w:type="page"/>
       </w:r>
     </w:p>
-    <w:p/>
     <w:p>
       <w:pPr>
         <w:jc w:val="center"/>
@@ -2959,6 +1734,145 @@
         <w:rPr>
           <w:noProof/>
         </w:rPr>
+        <w:lastRenderedPageBreak/>
+        <w:drawing>
+          <wp:inline distT="0" distB="0" distL="0" distR="0" wp14:anchorId="39A12A0E" wp14:editId="76D73299">
+            <wp:extent cx="2078530" cy="3699979"/>
+            <wp:effectExtent l="0" t="0" r="0" b="0"/>
+            <wp:docPr id="1431091555" name="Imagem 4" descr="Uma imagem contendo objeto, relógio, placar, placa"/>
+            <wp:cNvGraphicFramePr>
+              <a:graphicFrameLocks xmlns:a="http://schemas.openxmlformats.org/drawingml/2006/main" noChangeAspect="1"/>
+            </wp:cNvGraphicFramePr>
+            <a:graphic xmlns:a="http://schemas.openxmlformats.org/drawingml/2006/main">
+              <a:graphicData uri="http://schemas.openxmlformats.org/drawingml/2006/picture">
+                <pic:pic xmlns:pic="http://schemas.openxmlformats.org/drawingml/2006/picture">
+                  <pic:nvPicPr>
+                    <pic:cNvPr id="2000835278" name="Imagem 4" descr="Uma imagem contendo objeto, relógio, placar, placa"/>
+                    <pic:cNvPicPr/>
+                  </pic:nvPicPr>
+                  <pic:blipFill>
+                    <a:blip r:embed="rId8" cstate="print">
+                      <a:extLst>
+                        <a:ext uri="{28A0092B-C50C-407E-A947-70E740481C1C}">
+                          <a14:useLocalDpi xmlns:a14="http://schemas.microsoft.com/office/drawing/2010/main" val="0"/>
+                        </a:ext>
+                      </a:extLst>
+                    </a:blip>
+                    <a:stretch>
+                      <a:fillRect/>
+                    </a:stretch>
+                  </pic:blipFill>
+                  <pic:spPr>
+                    <a:xfrm>
+                      <a:off x="0" y="0"/>
+                      <a:ext cx="2092028" cy="3724007"/>
+                    </a:xfrm>
+                    <a:prstGeom prst="rect">
+                      <a:avLst/>
+                    </a:prstGeom>
+                  </pic:spPr>
+                </pic:pic>
+              </a:graphicData>
+            </a:graphic>
+          </wp:inline>
+        </w:drawing>
+      </w:r>
+    </w:p>
+    <w:p>
+      <w:pPr>
+        <w:pStyle w:val="Ttulo"/>
+        <w:numPr>
+          <w:ilvl w:val="0"/>
+          <w:numId w:val="42"/>
+        </w:numPr>
+        <w:jc w:val="center"/>
+      </w:pPr>
+      <w:r>
+        <w:t>Implementação Técnica</w:t>
+      </w:r>
+    </w:p>
+    <w:p>
+      <w:pPr>
+        <w:pStyle w:val="Ttulo1"/>
+      </w:pPr>
+      <w:r>
+        <w:t>TITULO 1</w:t>
+      </w:r>
+    </w:p>
+    <w:p>
+      <w:r>
+        <w:t>&lt;DESCRIÇÃO&gt;</w:t>
+      </w:r>
+    </w:p>
+    <w:p/>
+    <w:p/>
+    <w:p>
+      <w:pPr>
+        <w:pStyle w:val="Ttulo2"/>
+        <w:numPr>
+          <w:ilvl w:val="0"/>
+          <w:numId w:val="13"/>
+        </w:numPr>
+      </w:pPr>
+      <w:r>
+        <w:t>TITULO 2</w:t>
+      </w:r>
+    </w:p>
+    <w:p>
+      <w:r>
+        <w:t>&lt;texto&gt;</w:t>
+      </w:r>
+    </w:p>
+    <w:p/>
+    <w:p>
+      <w:pPr>
+        <w:pStyle w:val="CabealhodoSumrio"/>
+      </w:pPr>
+      <w:r>
+        <w:t>cabecalho</w:t>
+      </w:r>
+    </w:p>
+    <w:p>
+      <w:r>
+        <w:t>&lt;texto&gt;</w:t>
+      </w:r>
+    </w:p>
+    <w:p/>
+    <w:p>
+      <w:pPr>
+        <w:pStyle w:val="Ttulo3"/>
+        <w:rPr>
+          <w:b/>
+          <w:bCs/>
+        </w:rPr>
+      </w:pPr>
+      <w:r>
+        <w:rPr>
+          <w:b/>
+          <w:bCs/>
+        </w:rPr>
+        <w:t>TITULO 3</w:t>
+      </w:r>
+    </w:p>
+    <w:p>
+      <w:r>
+        <w:t>&lt;texto&gt;</w:t>
+      </w:r>
+    </w:p>
+    <w:p>
+      <w:r>
+        <w:br w:type="page"/>
+      </w:r>
+    </w:p>
+    <w:p>
+      <w:pPr>
+        <w:jc w:val="center"/>
+      </w:pPr>
+      <w:r>
+        <w:rPr>
+          <w:noProof/>
+        </w:rPr>
+        <w:lastRenderedPageBreak/>
         <w:drawing>
           <wp:inline distT="0" distB="0" distL="0" distR="0" wp14:anchorId="228BE697" wp14:editId="6C19F65F">
             <wp:extent cx="2078530" cy="3699979"/>
@@ -3005,6 +1919,877 @@
     <w:p>
       <w:pPr>
         <w:pStyle w:val="Ttulo"/>
+        <w:numPr>
+          <w:ilvl w:val="0"/>
+          <w:numId w:val="42"/>
+        </w:numPr>
+        <w:jc w:val="center"/>
+      </w:pPr>
+      <w:r>
+        <w:t>Definição do Problema</w:t>
+      </w:r>
+    </w:p>
+    <w:p>
+      <w:pPr>
+        <w:pStyle w:val="Ttulo1"/>
+      </w:pPr>
+      <w:bookmarkStart w:id="7" w:name="_Toc221432122"/>
+      <w:r>
+        <w:t>TITULO 1</w:t>
+      </w:r>
+      <w:bookmarkEnd w:id="7"/>
+    </w:p>
+    <w:p>
+      <w:r>
+        <w:t>&lt;DESCRIÇÃO&gt;</w:t>
+      </w:r>
+    </w:p>
+    <w:p/>
+    <w:p/>
+    <w:p>
+      <w:pPr>
+        <w:pStyle w:val="Ttulo2"/>
+        <w:numPr>
+          <w:ilvl w:val="0"/>
+          <w:numId w:val="13"/>
+        </w:numPr>
+      </w:pPr>
+      <w:bookmarkStart w:id="8" w:name="_Toc221432123"/>
+      <w:r>
+        <w:t>TITULO 2</w:t>
+      </w:r>
+      <w:bookmarkEnd w:id="8"/>
+    </w:p>
+    <w:p>
+      <w:r>
+        <w:t>&lt;texto&gt;</w:t>
+      </w:r>
+    </w:p>
+    <w:p/>
+    <w:p>
+      <w:pPr>
+        <w:pStyle w:val="CabealhodoSumrio"/>
+      </w:pPr>
+      <w:r>
+        <w:t>cabecalho</w:t>
+      </w:r>
+    </w:p>
+    <w:p>
+      <w:r>
+        <w:t>&lt;texto&gt;</w:t>
+      </w:r>
+    </w:p>
+    <w:p/>
+    <w:p>
+      <w:pPr>
+        <w:pStyle w:val="Ttulo3"/>
+        <w:rPr>
+          <w:b/>
+          <w:bCs/>
+        </w:rPr>
+      </w:pPr>
+      <w:bookmarkStart w:id="9" w:name="_Toc221432124"/>
+      <w:r>
+        <w:rPr>
+          <w:b/>
+          <w:bCs/>
+        </w:rPr>
+        <w:t>TITULO 3</w:t>
+      </w:r>
+      <w:bookmarkEnd w:id="9"/>
+    </w:p>
+    <w:p>
+      <w:r>
+        <w:t>&lt;texto&gt;</w:t>
+      </w:r>
+    </w:p>
+    <w:p>
+      <w:r>
+        <w:br w:type="page"/>
+      </w:r>
+    </w:p>
+    <w:p>
+      <w:pPr>
+        <w:jc w:val="center"/>
+      </w:pPr>
+      <w:r>
+        <w:rPr>
+          <w:noProof/>
+        </w:rPr>
+        <w:lastRenderedPageBreak/>
+        <w:drawing>
+          <wp:inline distT="0" distB="0" distL="0" distR="0" wp14:anchorId="1BCB138D" wp14:editId="58B9BBEC">
+            <wp:extent cx="2078530" cy="3699979"/>
+            <wp:effectExtent l="0" t="0" r="0" b="0"/>
+            <wp:docPr id="317844135" name="Imagem 4" descr="Uma imagem contendo objeto, relógio, placar, placa"/>
+            <wp:cNvGraphicFramePr>
+              <a:graphicFrameLocks xmlns:a="http://schemas.openxmlformats.org/drawingml/2006/main" noChangeAspect="1"/>
+            </wp:cNvGraphicFramePr>
+            <a:graphic xmlns:a="http://schemas.openxmlformats.org/drawingml/2006/main">
+              <a:graphicData uri="http://schemas.openxmlformats.org/drawingml/2006/picture">
+                <pic:pic xmlns:pic="http://schemas.openxmlformats.org/drawingml/2006/picture">
+                  <pic:nvPicPr>
+                    <pic:cNvPr id="2000835278" name="Imagem 4" descr="Uma imagem contendo objeto, relógio, placar, placa"/>
+                    <pic:cNvPicPr/>
+                  </pic:nvPicPr>
+                  <pic:blipFill>
+                    <a:blip r:embed="rId8" cstate="print">
+                      <a:extLst>
+                        <a:ext uri="{28A0092B-C50C-407E-A947-70E740481C1C}">
+                          <a14:useLocalDpi xmlns:a14="http://schemas.microsoft.com/office/drawing/2010/main" val="0"/>
+                        </a:ext>
+                      </a:extLst>
+                    </a:blip>
+                    <a:stretch>
+                      <a:fillRect/>
+                    </a:stretch>
+                  </pic:blipFill>
+                  <pic:spPr>
+                    <a:xfrm>
+                      <a:off x="0" y="0"/>
+                      <a:ext cx="2092028" cy="3724007"/>
+                    </a:xfrm>
+                    <a:prstGeom prst="rect">
+                      <a:avLst/>
+                    </a:prstGeom>
+                  </pic:spPr>
+                </pic:pic>
+              </a:graphicData>
+            </a:graphic>
+          </wp:inline>
+        </w:drawing>
+      </w:r>
+    </w:p>
+    <w:p>
+      <w:pPr>
+        <w:pStyle w:val="Ttulo"/>
+        <w:numPr>
+          <w:ilvl w:val="0"/>
+          <w:numId w:val="42"/>
+        </w:numPr>
+        <w:jc w:val="center"/>
+      </w:pPr>
+      <w:r>
+        <w:t>Codificação e Representação de Indivíduos</w:t>
+      </w:r>
+    </w:p>
+    <w:p>
+      <w:pPr>
+        <w:pStyle w:val="Ttulo1"/>
+      </w:pPr>
+      <w:r>
+        <w:t>TITULO 1</w:t>
+      </w:r>
+    </w:p>
+    <w:p>
+      <w:r>
+        <w:t>&lt;DESCRIÇÃO&gt;</w:t>
+      </w:r>
+    </w:p>
+    <w:p/>
+    <w:p/>
+    <w:p>
+      <w:pPr>
+        <w:pStyle w:val="Ttulo2"/>
+        <w:numPr>
+          <w:ilvl w:val="0"/>
+          <w:numId w:val="13"/>
+        </w:numPr>
+      </w:pPr>
+      <w:r>
+        <w:t>TITULO 2</w:t>
+      </w:r>
+    </w:p>
+    <w:p>
+      <w:r>
+        <w:t>&lt;texto&gt;</w:t>
+      </w:r>
+    </w:p>
+    <w:p/>
+    <w:p>
+      <w:pPr>
+        <w:pStyle w:val="CabealhodoSumrio"/>
+      </w:pPr>
+      <w:r>
+        <w:t>cabecalho</w:t>
+      </w:r>
+    </w:p>
+    <w:p>
+      <w:r>
+        <w:t>&lt;texto&gt;</w:t>
+      </w:r>
+    </w:p>
+    <w:p/>
+    <w:p>
+      <w:pPr>
+        <w:pStyle w:val="Ttulo3"/>
+        <w:rPr>
+          <w:b/>
+          <w:bCs/>
+        </w:rPr>
+      </w:pPr>
+      <w:r>
+        <w:rPr>
+          <w:b/>
+          <w:bCs/>
+        </w:rPr>
+        <w:t>TITULO 3</w:t>
+      </w:r>
+    </w:p>
+    <w:p>
+      <w:r>
+        <w:t>&lt;texto&gt;</w:t>
+      </w:r>
+    </w:p>
+    <w:p>
+      <w:pPr>
+        <w:jc w:val="center"/>
+      </w:pPr>
+      <w:r>
+        <w:br w:type="page"/>
+      </w:r>
+      <w:r>
+        <w:rPr>
+          <w:noProof/>
+        </w:rPr>
+        <w:lastRenderedPageBreak/>
+        <w:drawing>
+          <wp:inline distT="0" distB="0" distL="0" distR="0" wp14:anchorId="11F5EA19" wp14:editId="22226AF8">
+            <wp:extent cx="2078530" cy="3699979"/>
+            <wp:effectExtent l="0" t="0" r="0" b="0"/>
+            <wp:docPr id="448860263" name="Imagem 4" descr="Uma imagem contendo objeto, relógio, placar, placa"/>
+            <wp:cNvGraphicFramePr>
+              <a:graphicFrameLocks xmlns:a="http://schemas.openxmlformats.org/drawingml/2006/main" noChangeAspect="1"/>
+            </wp:cNvGraphicFramePr>
+            <a:graphic xmlns:a="http://schemas.openxmlformats.org/drawingml/2006/main">
+              <a:graphicData uri="http://schemas.openxmlformats.org/drawingml/2006/picture">
+                <pic:pic xmlns:pic="http://schemas.openxmlformats.org/drawingml/2006/picture">
+                  <pic:nvPicPr>
+                    <pic:cNvPr id="2000835278" name="Imagem 4" descr="Uma imagem contendo objeto, relógio, placar, placa"/>
+                    <pic:cNvPicPr/>
+                  </pic:nvPicPr>
+                  <pic:blipFill>
+                    <a:blip r:embed="rId8" cstate="print">
+                      <a:extLst>
+                        <a:ext uri="{28A0092B-C50C-407E-A947-70E740481C1C}">
+                          <a14:useLocalDpi xmlns:a14="http://schemas.microsoft.com/office/drawing/2010/main" val="0"/>
+                        </a:ext>
+                      </a:extLst>
+                    </a:blip>
+                    <a:stretch>
+                      <a:fillRect/>
+                    </a:stretch>
+                  </pic:blipFill>
+                  <pic:spPr>
+                    <a:xfrm>
+                      <a:off x="0" y="0"/>
+                      <a:ext cx="2092028" cy="3724007"/>
+                    </a:xfrm>
+                    <a:prstGeom prst="rect">
+                      <a:avLst/>
+                    </a:prstGeom>
+                  </pic:spPr>
+                </pic:pic>
+              </a:graphicData>
+            </a:graphic>
+          </wp:inline>
+        </w:drawing>
+      </w:r>
+    </w:p>
+    <w:p>
+      <w:pPr>
+        <w:pStyle w:val="Ttulo"/>
+        <w:numPr>
+          <w:ilvl w:val="0"/>
+          <w:numId w:val="42"/>
+        </w:numPr>
+        <w:jc w:val="center"/>
+      </w:pPr>
+      <w:r>
+        <w:t>Dinâmica do Algoritmo Genético</w:t>
+      </w:r>
+    </w:p>
+    <w:p>
+      <w:pPr>
+        <w:pStyle w:val="Ttulo1"/>
+        <w:numPr>
+          <w:ilvl w:val="0"/>
+          <w:numId w:val="43"/>
+        </w:numPr>
+      </w:pPr>
+      <w:r>
+        <w:rPr>
+          <w:b/>
+          <w:bCs/>
+        </w:rPr>
+        <w:t>Inicialização da População</w:t>
+      </w:r>
+    </w:p>
+    <w:p>
+      <w:r>
+        <w:t>&lt;DESCRIÇÃO&gt;</w:t>
+      </w:r>
+    </w:p>
+    <w:p/>
+    <w:p/>
+    <w:p>
+      <w:pPr>
+        <w:pStyle w:val="Ttulo1"/>
+        <w:numPr>
+          <w:ilvl w:val="0"/>
+          <w:numId w:val="43"/>
+        </w:numPr>
+      </w:pPr>
+      <w:r>
+        <w:rPr>
+          <w:b/>
+          <w:bCs/>
+        </w:rPr>
+        <w:t>Avaliação de Aptidão (</w:t>
+      </w:r>
+      <w:r>
+        <w:rPr>
+          <w:b/>
+          <w:bCs/>
+          <w:i/>
+          <w:iCs/>
+        </w:rPr>
+        <w:t>Fitness</w:t>
+      </w:r>
+      <w:r>
+        <w:rPr>
+          <w:b/>
+          <w:bCs/>
+        </w:rPr>
+        <w:t>)</w:t>
+      </w:r>
+    </w:p>
+    <w:p>
+      <w:r>
+        <w:t>&lt;DESCRIÇÃO&gt;</w:t>
+      </w:r>
+    </w:p>
+    <w:p/>
+    <w:p>
+      <w:pPr>
+        <w:pStyle w:val="Ttulo1"/>
+        <w:numPr>
+          <w:ilvl w:val="0"/>
+          <w:numId w:val="43"/>
+        </w:numPr>
+      </w:pPr>
+      <w:r>
+        <w:rPr>
+          <w:b/>
+          <w:bCs/>
+        </w:rPr>
+        <w:t>Condição de término</w:t>
+      </w:r>
+    </w:p>
+    <w:p>
+      <w:r>
+        <w:t>&lt;DESCRIÇÃO&gt;</w:t>
+      </w:r>
+    </w:p>
+    <w:p/>
+    <w:p/>
+    <w:p/>
+    <w:p>
+      <w:pPr>
+        <w:pStyle w:val="Ttulo1"/>
+        <w:numPr>
+          <w:ilvl w:val="0"/>
+          <w:numId w:val="43"/>
+        </w:numPr>
+      </w:pPr>
+      <w:r>
+        <w:rPr>
+          <w:b/>
+          <w:bCs/>
+        </w:rPr>
+        <w:lastRenderedPageBreak/>
+        <w:t>Operadores</w:t>
+      </w:r>
+      <w:r>
+        <w:rPr>
+          <w:b/>
+          <w:bCs/>
+        </w:rPr>
+        <w:t xml:space="preserve"> de Seleção</w:t>
+      </w:r>
+    </w:p>
+    <w:p>
+      <w:r>
+        <w:t>&lt;DESCRIÇÃO&gt;</w:t>
+      </w:r>
+    </w:p>
+    <w:p/>
+    <w:p>
+      <w:pPr>
+        <w:pStyle w:val="Ttulo1"/>
+        <w:numPr>
+          <w:ilvl w:val="0"/>
+          <w:numId w:val="43"/>
+        </w:numPr>
+      </w:pPr>
+      <w:r>
+        <w:rPr>
+          <w:b/>
+          <w:bCs/>
+        </w:rPr>
+        <w:t xml:space="preserve">Operadores de </w:t>
+      </w:r>
+      <w:r>
+        <w:rPr>
+          <w:b/>
+          <w:bCs/>
+        </w:rPr>
+        <w:t>Cruzamento</w:t>
+      </w:r>
+    </w:p>
+    <w:p>
+      <w:r>
+        <w:t>&lt;DESCRIÇÃO&gt;</w:t>
+      </w:r>
+    </w:p>
+    <w:p/>
+    <w:p/>
+    <w:p>
+      <w:pPr>
+        <w:pStyle w:val="Ttulo1"/>
+        <w:numPr>
+          <w:ilvl w:val="0"/>
+          <w:numId w:val="43"/>
+        </w:numPr>
+      </w:pPr>
+      <w:r>
+        <w:rPr>
+          <w:b/>
+          <w:bCs/>
+        </w:rPr>
+        <w:t xml:space="preserve">Operadores de </w:t>
+      </w:r>
+      <w:r>
+        <w:rPr>
+          <w:b/>
+          <w:bCs/>
+        </w:rPr>
+        <w:t>Mutação</w:t>
+      </w:r>
+    </w:p>
+    <w:p>
+      <w:r>
+        <w:t>&lt;DESCRIÇÃO&gt;</w:t>
+      </w:r>
+    </w:p>
+    <w:p/>
+    <w:p>
+      <w:pPr>
+        <w:pStyle w:val="Ttulo1"/>
+        <w:numPr>
+          <w:ilvl w:val="0"/>
+          <w:numId w:val="43"/>
+        </w:numPr>
+      </w:pPr>
+      <w:r>
+        <w:rPr>
+          <w:b/>
+          <w:bCs/>
+        </w:rPr>
+        <w:t>Substituição da População antiga</w:t>
+      </w:r>
+    </w:p>
+    <w:p>
+      <w:r>
+        <w:t>&lt;DESCRIÇÃO&gt;</w:t>
+      </w:r>
+    </w:p>
+    <w:p/>
+    <w:p/>
+    <w:p>
+      <w:pPr>
+        <w:pStyle w:val="Ttulo2"/>
+        <w:numPr>
+          <w:ilvl w:val="0"/>
+          <w:numId w:val="13"/>
+        </w:numPr>
+      </w:pPr>
+      <w:r>
+        <w:t>TITULO 2</w:t>
+      </w:r>
+    </w:p>
+    <w:p>
+      <w:r>
+        <w:t>&lt;texto&gt;</w:t>
+      </w:r>
+    </w:p>
+    <w:p/>
+    <w:p>
+      <w:pPr>
+        <w:pStyle w:val="CabealhodoSumrio"/>
+      </w:pPr>
+      <w:r>
+        <w:t>cabecalho</w:t>
+      </w:r>
+    </w:p>
+    <w:p>
+      <w:r>
+        <w:t>&lt;texto&gt;</w:t>
+      </w:r>
+    </w:p>
+    <w:p/>
+    <w:p>
+      <w:pPr>
+        <w:pStyle w:val="Ttulo3"/>
+        <w:rPr>
+          <w:b/>
+          <w:bCs/>
+        </w:rPr>
+      </w:pPr>
+      <w:r>
+        <w:rPr>
+          <w:b/>
+          <w:bCs/>
+        </w:rPr>
+        <w:t>TITULO 3</w:t>
+      </w:r>
+    </w:p>
+    <w:p>
+      <w:r>
+        <w:t>&lt;texto&gt;</w:t>
+      </w:r>
+    </w:p>
+    <w:p>
+      <w:r>
+        <w:br w:type="page"/>
+      </w:r>
+    </w:p>
+    <w:p>
+      <w:pPr>
+        <w:jc w:val="center"/>
+      </w:pPr>
+      <w:r>
+        <w:rPr>
+          <w:noProof/>
+        </w:rPr>
+        <w:lastRenderedPageBreak/>
+        <w:drawing>
+          <wp:inline distT="0" distB="0" distL="0" distR="0" wp14:anchorId="16E60219" wp14:editId="10EB44C3">
+            <wp:extent cx="2078530" cy="3699979"/>
+            <wp:effectExtent l="0" t="0" r="0" b="0"/>
+            <wp:docPr id="323418307" name="Imagem 4" descr="Uma imagem contendo objeto, relógio, placar, placa"/>
+            <wp:cNvGraphicFramePr>
+              <a:graphicFrameLocks xmlns:a="http://schemas.openxmlformats.org/drawingml/2006/main" noChangeAspect="1"/>
+            </wp:cNvGraphicFramePr>
+            <a:graphic xmlns:a="http://schemas.openxmlformats.org/drawingml/2006/main">
+              <a:graphicData uri="http://schemas.openxmlformats.org/drawingml/2006/picture">
+                <pic:pic xmlns:pic="http://schemas.openxmlformats.org/drawingml/2006/picture">
+                  <pic:nvPicPr>
+                    <pic:cNvPr id="2000835278" name="Imagem 4" descr="Uma imagem contendo objeto, relógio, placar, placa"/>
+                    <pic:cNvPicPr/>
+                  </pic:nvPicPr>
+                  <pic:blipFill>
+                    <a:blip r:embed="rId8" cstate="print">
+                      <a:extLst>
+                        <a:ext uri="{28A0092B-C50C-407E-A947-70E740481C1C}">
+                          <a14:useLocalDpi xmlns:a14="http://schemas.microsoft.com/office/drawing/2010/main" val="0"/>
+                        </a:ext>
+                      </a:extLst>
+                    </a:blip>
+                    <a:stretch>
+                      <a:fillRect/>
+                    </a:stretch>
+                  </pic:blipFill>
+                  <pic:spPr>
+                    <a:xfrm>
+                      <a:off x="0" y="0"/>
+                      <a:ext cx="2092028" cy="3724007"/>
+                    </a:xfrm>
+                    <a:prstGeom prst="rect">
+                      <a:avLst/>
+                    </a:prstGeom>
+                  </pic:spPr>
+                </pic:pic>
+              </a:graphicData>
+            </a:graphic>
+          </wp:inline>
+        </w:drawing>
+      </w:r>
+    </w:p>
+    <w:p>
+      <w:pPr>
+        <w:pStyle w:val="Ttulo"/>
+        <w:numPr>
+          <w:ilvl w:val="0"/>
+          <w:numId w:val="42"/>
+        </w:numPr>
+        <w:jc w:val="center"/>
+      </w:pPr>
+      <w:r>
+        <w:t>Monitoramento de Performance</w:t>
+      </w:r>
+    </w:p>
+    <w:p>
+      <w:pPr>
+        <w:pStyle w:val="Ttulo1"/>
+      </w:pPr>
+      <w:r>
+        <w:t>TITULO 1</w:t>
+      </w:r>
+    </w:p>
+    <w:p>
+      <w:r>
+        <w:t>&lt;DESCRIÇÃO&gt;</w:t>
+      </w:r>
+    </w:p>
+    <w:p/>
+    <w:p/>
+    <w:p>
+      <w:pPr>
+        <w:pStyle w:val="Ttulo2"/>
+        <w:numPr>
+          <w:ilvl w:val="0"/>
+          <w:numId w:val="13"/>
+        </w:numPr>
+      </w:pPr>
+      <w:r>
+        <w:t>TITULO 2</w:t>
+      </w:r>
+    </w:p>
+    <w:p>
+      <w:r>
+        <w:t>&lt;texto&gt;</w:t>
+      </w:r>
+    </w:p>
+    <w:p/>
+    <w:p>
+      <w:pPr>
+        <w:pStyle w:val="CabealhodoSumrio"/>
+      </w:pPr>
+      <w:r>
+        <w:t>cabecalho</w:t>
+      </w:r>
+    </w:p>
+    <w:p>
+      <w:r>
+        <w:t>&lt;texto&gt;</w:t>
+      </w:r>
+    </w:p>
+    <w:p/>
+    <w:p>
+      <w:pPr>
+        <w:pStyle w:val="Ttulo3"/>
+        <w:rPr>
+          <w:b/>
+          <w:bCs/>
+        </w:rPr>
+      </w:pPr>
+      <w:r>
+        <w:rPr>
+          <w:b/>
+          <w:bCs/>
+        </w:rPr>
+        <w:t>TITULO 3</w:t>
+      </w:r>
+    </w:p>
+    <w:p>
+      <w:r>
+        <w:t>&lt;texto&gt;</w:t>
+      </w:r>
+    </w:p>
+    <w:p>
+      <w:r>
+        <w:br w:type="page"/>
+      </w:r>
+    </w:p>
+    <w:p>
+      <w:pPr>
+        <w:jc w:val="center"/>
+      </w:pPr>
+      <w:r>
+        <w:rPr>
+          <w:noProof/>
+        </w:rPr>
+        <w:lastRenderedPageBreak/>
+        <w:drawing>
+          <wp:inline distT="0" distB="0" distL="0" distR="0" wp14:anchorId="28935A58" wp14:editId="37FD9C1D">
+            <wp:extent cx="2078530" cy="3699979"/>
+            <wp:effectExtent l="0" t="0" r="0" b="0"/>
+            <wp:docPr id="1745034595" name="Imagem 4" descr="Uma imagem contendo objeto, relógio, placar, placa"/>
+            <wp:cNvGraphicFramePr>
+              <a:graphicFrameLocks xmlns:a="http://schemas.openxmlformats.org/drawingml/2006/main" noChangeAspect="1"/>
+            </wp:cNvGraphicFramePr>
+            <a:graphic xmlns:a="http://schemas.openxmlformats.org/drawingml/2006/main">
+              <a:graphicData uri="http://schemas.openxmlformats.org/drawingml/2006/picture">
+                <pic:pic xmlns:pic="http://schemas.openxmlformats.org/drawingml/2006/picture">
+                  <pic:nvPicPr>
+                    <pic:cNvPr id="2000835278" name="Imagem 4" descr="Uma imagem contendo objeto, relógio, placar, placa"/>
+                    <pic:cNvPicPr/>
+                  </pic:nvPicPr>
+                  <pic:blipFill>
+                    <a:blip r:embed="rId8" cstate="print">
+                      <a:extLst>
+                        <a:ext uri="{28A0092B-C50C-407E-A947-70E740481C1C}">
+                          <a14:useLocalDpi xmlns:a14="http://schemas.microsoft.com/office/drawing/2010/main" val="0"/>
+                        </a:ext>
+                      </a:extLst>
+                    </a:blip>
+                    <a:stretch>
+                      <a:fillRect/>
+                    </a:stretch>
+                  </pic:blipFill>
+                  <pic:spPr>
+                    <a:xfrm>
+                      <a:off x="0" y="0"/>
+                      <a:ext cx="2092028" cy="3724007"/>
+                    </a:xfrm>
+                    <a:prstGeom prst="rect">
+                      <a:avLst/>
+                    </a:prstGeom>
+                  </pic:spPr>
+                </pic:pic>
+              </a:graphicData>
+            </a:graphic>
+          </wp:inline>
+        </w:drawing>
+      </w:r>
+    </w:p>
+    <w:p>
+      <w:pPr>
+        <w:pStyle w:val="Ttulo"/>
+        <w:numPr>
+          <w:ilvl w:val="0"/>
+          <w:numId w:val="42"/>
+        </w:numPr>
+        <w:jc w:val="center"/>
+      </w:pPr>
+      <w:r>
+        <w:t>Conclusões e Desafios de Otimização</w:t>
+      </w:r>
+    </w:p>
+    <w:p>
+      <w:pPr>
+        <w:pStyle w:val="Ttulo1"/>
+      </w:pPr>
+      <w:r>
+        <w:t>TITULO 1</w:t>
+      </w:r>
+    </w:p>
+    <w:p>
+      <w:r>
+        <w:t>&lt;DESCRIÇÃO&gt;</w:t>
+      </w:r>
+    </w:p>
+    <w:p/>
+    <w:p/>
+    <w:p>
+      <w:pPr>
+        <w:pStyle w:val="Ttulo2"/>
+        <w:numPr>
+          <w:ilvl w:val="0"/>
+          <w:numId w:val="13"/>
+        </w:numPr>
+      </w:pPr>
+      <w:r>
+        <w:t>TITULO 2</w:t>
+      </w:r>
+    </w:p>
+    <w:p>
+      <w:r>
+        <w:t>&lt;texto&gt;</w:t>
+      </w:r>
+    </w:p>
+    <w:p/>
+    <w:p>
+      <w:pPr>
+        <w:pStyle w:val="CabealhodoSumrio"/>
+      </w:pPr>
+      <w:r>
+        <w:t>cabecalho</w:t>
+      </w:r>
+    </w:p>
+    <w:p>
+      <w:r>
+        <w:t>&lt;texto&gt;</w:t>
+      </w:r>
+    </w:p>
+    <w:p/>
+    <w:p>
+      <w:pPr>
+        <w:pStyle w:val="Ttulo3"/>
+        <w:rPr>
+          <w:b/>
+          <w:bCs/>
+        </w:rPr>
+      </w:pPr>
+      <w:r>
+        <w:rPr>
+          <w:b/>
+          <w:bCs/>
+        </w:rPr>
+        <w:t>TITULO 3</w:t>
+      </w:r>
+    </w:p>
+    <w:p>
+      <w:r>
+        <w:t>&lt;texto&gt;</w:t>
+      </w:r>
+    </w:p>
+    <w:p>
+      <w:pPr>
+        <w:jc w:val="center"/>
+      </w:pPr>
+      <w:r>
+        <w:rPr>
+          <w:noProof/>
+        </w:rPr>
+        <w:lastRenderedPageBreak/>
+        <w:drawing>
+          <wp:inline distT="0" distB="0" distL="0" distR="0" wp14:anchorId="47BFFE27" wp14:editId="2B8601C0">
+            <wp:extent cx="2078530" cy="3699979"/>
+            <wp:effectExtent l="0" t="0" r="0" b="0"/>
+            <wp:docPr id="753668571" name="Imagem 4" descr="Uma imagem contendo objeto, relógio, placar, placa"/>
+            <wp:cNvGraphicFramePr>
+              <a:graphicFrameLocks xmlns:a="http://schemas.openxmlformats.org/drawingml/2006/main" noChangeAspect="1"/>
+            </wp:cNvGraphicFramePr>
+            <a:graphic xmlns:a="http://schemas.openxmlformats.org/drawingml/2006/main">
+              <a:graphicData uri="http://schemas.openxmlformats.org/drawingml/2006/picture">
+                <pic:pic xmlns:pic="http://schemas.openxmlformats.org/drawingml/2006/picture">
+                  <pic:nvPicPr>
+                    <pic:cNvPr id="2000835278" name="Imagem 4" descr="Uma imagem contendo objeto, relógio, placar, placa"/>
+                    <pic:cNvPicPr/>
+                  </pic:nvPicPr>
+                  <pic:blipFill>
+                    <a:blip r:embed="rId8" cstate="print">
+                      <a:extLst>
+                        <a:ext uri="{28A0092B-C50C-407E-A947-70E740481C1C}">
+                          <a14:useLocalDpi xmlns:a14="http://schemas.microsoft.com/office/drawing/2010/main" val="0"/>
+                        </a:ext>
+                      </a:extLst>
+                    </a:blip>
+                    <a:stretch>
+                      <a:fillRect/>
+                    </a:stretch>
+                  </pic:blipFill>
+                  <pic:spPr>
+                    <a:xfrm>
+                      <a:off x="0" y="0"/>
+                      <a:ext cx="2092028" cy="3724007"/>
+                    </a:xfrm>
+                    <a:prstGeom prst="rect">
+                      <a:avLst/>
+                    </a:prstGeom>
+                  </pic:spPr>
+                </pic:pic>
+              </a:graphicData>
+            </a:graphic>
+          </wp:inline>
+        </w:drawing>
+      </w:r>
+    </w:p>
+    <w:p>
+      <w:pPr>
+        <w:pStyle w:val="Ttulo"/>
         <w:jc w:val="center"/>
         <w:rPr>
           <w:sz w:val="72"/>
@@ -3012,10 +2797,6 @@
         </w:rPr>
       </w:pPr>
       <w:r>
-        <w:rPr>
-          <w:sz w:val="72"/>
-          <w:szCs w:val="72"/>
-        </w:rPr>
         <w:t>TITULO</w:t>
       </w:r>
     </w:p>
@@ -3087,6 +2868,282 @@
         <w:t>&lt;texto&gt;</w:t>
       </w:r>
     </w:p>
+    <w:p>
+      <w:r>
+        <w:br w:type="page"/>
+      </w:r>
+    </w:p>
+    <w:p>
+      <w:pPr>
+        <w:jc w:val="center"/>
+      </w:pPr>
+      <w:r>
+        <w:rPr>
+          <w:noProof/>
+        </w:rPr>
+        <w:lastRenderedPageBreak/>
+        <w:drawing>
+          <wp:inline distT="0" distB="0" distL="0" distR="0" wp14:anchorId="499D8B07" wp14:editId="3BEB5AAB">
+            <wp:extent cx="2078530" cy="3699979"/>
+            <wp:effectExtent l="0" t="0" r="0" b="0"/>
+            <wp:docPr id="978910128" name="Imagem 4" descr="Uma imagem contendo objeto, relógio, placar, placa"/>
+            <wp:cNvGraphicFramePr>
+              <a:graphicFrameLocks xmlns:a="http://schemas.openxmlformats.org/drawingml/2006/main" noChangeAspect="1"/>
+            </wp:cNvGraphicFramePr>
+            <a:graphic xmlns:a="http://schemas.openxmlformats.org/drawingml/2006/main">
+              <a:graphicData uri="http://schemas.openxmlformats.org/drawingml/2006/picture">
+                <pic:pic xmlns:pic="http://schemas.openxmlformats.org/drawingml/2006/picture">
+                  <pic:nvPicPr>
+                    <pic:cNvPr id="2000835278" name="Imagem 4" descr="Uma imagem contendo objeto, relógio, placar, placa"/>
+                    <pic:cNvPicPr/>
+                  </pic:nvPicPr>
+                  <pic:blipFill>
+                    <a:blip r:embed="rId8" cstate="print">
+                      <a:extLst>
+                        <a:ext uri="{28A0092B-C50C-407E-A947-70E740481C1C}">
+                          <a14:useLocalDpi xmlns:a14="http://schemas.microsoft.com/office/drawing/2010/main" val="0"/>
+                        </a:ext>
+                      </a:extLst>
+                    </a:blip>
+                    <a:stretch>
+                      <a:fillRect/>
+                    </a:stretch>
+                  </pic:blipFill>
+                  <pic:spPr>
+                    <a:xfrm>
+                      <a:off x="0" y="0"/>
+                      <a:ext cx="2092028" cy="3724007"/>
+                    </a:xfrm>
+                    <a:prstGeom prst="rect">
+                      <a:avLst/>
+                    </a:prstGeom>
+                  </pic:spPr>
+                </pic:pic>
+              </a:graphicData>
+            </a:graphic>
+          </wp:inline>
+        </w:drawing>
+      </w:r>
+    </w:p>
+    <w:p>
+      <w:pPr>
+        <w:pStyle w:val="Ttulo"/>
+        <w:jc w:val="center"/>
+      </w:pPr>
+      <w:r>
+        <w:t>TITULO</w:t>
+      </w:r>
+    </w:p>
+    <w:p>
+      <w:pPr>
+        <w:pStyle w:val="Ttulo1"/>
+      </w:pPr>
+      <w:r>
+        <w:t>TITULO 1</w:t>
+      </w:r>
+    </w:p>
+    <w:p>
+      <w:r>
+        <w:t>&lt;DESCRIÇÃO&gt;</w:t>
+      </w:r>
+    </w:p>
+    <w:p/>
+    <w:p/>
+    <w:p>
+      <w:pPr>
+        <w:pStyle w:val="Ttulo2"/>
+        <w:numPr>
+          <w:ilvl w:val="0"/>
+          <w:numId w:val="13"/>
+        </w:numPr>
+      </w:pPr>
+      <w:r>
+        <w:t>TITULO 2</w:t>
+      </w:r>
+    </w:p>
+    <w:p>
+      <w:r>
+        <w:t>&lt;texto&gt;</w:t>
+      </w:r>
+    </w:p>
+    <w:p/>
+    <w:p>
+      <w:pPr>
+        <w:pStyle w:val="CabealhodoSumrio"/>
+      </w:pPr>
+      <w:r>
+        <w:t>cabecalho</w:t>
+      </w:r>
+    </w:p>
+    <w:p>
+      <w:r>
+        <w:t>&lt;texto&gt;</w:t>
+      </w:r>
+    </w:p>
+    <w:p/>
+    <w:p>
+      <w:pPr>
+        <w:pStyle w:val="Ttulo3"/>
+        <w:rPr>
+          <w:b/>
+          <w:bCs/>
+        </w:rPr>
+      </w:pPr>
+      <w:r>
+        <w:rPr>
+          <w:b/>
+          <w:bCs/>
+        </w:rPr>
+        <w:t>TITULO 3</w:t>
+      </w:r>
+    </w:p>
+    <w:p>
+      <w:r>
+        <w:t>&lt;texto&gt;</w:t>
+      </w:r>
+    </w:p>
+    <w:p>
+      <w:r>
+        <w:br w:type="page"/>
+      </w:r>
+    </w:p>
+    <w:p>
+      <w:pPr>
+        <w:jc w:val="center"/>
+      </w:pPr>
+      <w:r>
+        <w:rPr>
+          <w:noProof/>
+        </w:rPr>
+        <w:lastRenderedPageBreak/>
+        <w:drawing>
+          <wp:inline distT="0" distB="0" distL="0" distR="0" wp14:anchorId="7595B9DB" wp14:editId="0C080737">
+            <wp:extent cx="2078530" cy="3699979"/>
+            <wp:effectExtent l="0" t="0" r="0" b="0"/>
+            <wp:docPr id="2071672" name="Imagem 4" descr="Uma imagem contendo objeto, relógio, placar, placa"/>
+            <wp:cNvGraphicFramePr>
+              <a:graphicFrameLocks xmlns:a="http://schemas.openxmlformats.org/drawingml/2006/main" noChangeAspect="1"/>
+            </wp:cNvGraphicFramePr>
+            <a:graphic xmlns:a="http://schemas.openxmlformats.org/drawingml/2006/main">
+              <a:graphicData uri="http://schemas.openxmlformats.org/drawingml/2006/picture">
+                <pic:pic xmlns:pic="http://schemas.openxmlformats.org/drawingml/2006/picture">
+                  <pic:nvPicPr>
+                    <pic:cNvPr id="2000835278" name="Imagem 4" descr="Uma imagem contendo objeto, relógio, placar, placa"/>
+                    <pic:cNvPicPr/>
+                  </pic:nvPicPr>
+                  <pic:blipFill>
+                    <a:blip r:embed="rId8" cstate="print">
+                      <a:extLst>
+                        <a:ext uri="{28A0092B-C50C-407E-A947-70E740481C1C}">
+                          <a14:useLocalDpi xmlns:a14="http://schemas.microsoft.com/office/drawing/2010/main" val="0"/>
+                        </a:ext>
+                      </a:extLst>
+                    </a:blip>
+                    <a:stretch>
+                      <a:fillRect/>
+                    </a:stretch>
+                  </pic:blipFill>
+                  <pic:spPr>
+                    <a:xfrm>
+                      <a:off x="0" y="0"/>
+                      <a:ext cx="2092028" cy="3724007"/>
+                    </a:xfrm>
+                    <a:prstGeom prst="rect">
+                      <a:avLst/>
+                    </a:prstGeom>
+                  </pic:spPr>
+                </pic:pic>
+              </a:graphicData>
+            </a:graphic>
+          </wp:inline>
+        </w:drawing>
+      </w:r>
+    </w:p>
+    <w:p>
+      <w:pPr>
+        <w:pStyle w:val="Ttulo"/>
+        <w:jc w:val="center"/>
+      </w:pPr>
+      <w:r>
+        <w:t>TITULO</w:t>
+      </w:r>
+    </w:p>
+    <w:p>
+      <w:pPr>
+        <w:pStyle w:val="Ttulo1"/>
+      </w:pPr>
+      <w:r>
+        <w:t>TITULO 1</w:t>
+      </w:r>
+    </w:p>
+    <w:p>
+      <w:r>
+        <w:t>&lt;DESCRIÇÃO&gt;</w:t>
+      </w:r>
+    </w:p>
+    <w:p/>
+    <w:p/>
+    <w:p>
+      <w:pPr>
+        <w:pStyle w:val="Ttulo2"/>
+        <w:numPr>
+          <w:ilvl w:val="0"/>
+          <w:numId w:val="13"/>
+        </w:numPr>
+      </w:pPr>
+      <w:r>
+        <w:t>TITULO 2</w:t>
+      </w:r>
+    </w:p>
+    <w:p>
+      <w:r>
+        <w:t>&lt;texto&gt;</w:t>
+      </w:r>
+    </w:p>
+    <w:p/>
+    <w:p>
+      <w:pPr>
+        <w:pStyle w:val="CabealhodoSumrio"/>
+      </w:pPr>
+      <w:r>
+        <w:t>cabecalho</w:t>
+      </w:r>
+    </w:p>
+    <w:p>
+      <w:r>
+        <w:t>&lt;texto&gt;</w:t>
+      </w:r>
+    </w:p>
+    <w:p/>
+    <w:p>
+      <w:pPr>
+        <w:pStyle w:val="Ttulo3"/>
+        <w:rPr>
+          <w:b/>
+          <w:bCs/>
+        </w:rPr>
+      </w:pPr>
+      <w:r>
+        <w:rPr>
+          <w:b/>
+          <w:bCs/>
+        </w:rPr>
+        <w:t>TITULO 3</w:t>
+      </w:r>
+    </w:p>
+    <w:p>
+      <w:r>
+        <w:t>&lt;texto&gt;</w:t>
+      </w:r>
+    </w:p>
+    <w:p/>
+    <w:p/>
+    <w:p/>
+    <w:p/>
+    <w:p/>
+    <w:p/>
+    <w:p/>
+    <w:p/>
     <w:p/>
     <w:sectPr>
       <w:pgSz w:w="11906" w:h="16838"/>
@@ -4571,6 +4628,92 @@
     </w:lvl>
   </w:abstractNum>
   <w:abstractNum w:abstractNumId="15" w15:restartNumberingAfterBreak="0">
+    <w:nsid w:val="2E6C0F8D"/>
+    <w:multiLevelType w:val="hybridMultilevel"/>
+    <w:tmpl w:val="6944B688"/>
+    <w:lvl w:ilvl="0" w:tplc="0416000F">
+      <w:start w:val="1"/>
+      <w:numFmt w:val="decimal"/>
+      <w:lvlText w:val="%1."/>
+      <w:lvlJc w:val="left"/>
+      <w:pPr>
+        <w:ind w:left="720" w:hanging="360"/>
+      </w:pPr>
+    </w:lvl>
+    <w:lvl w:ilvl="1" w:tplc="04160019" w:tentative="1">
+      <w:start w:val="1"/>
+      <w:numFmt w:val="lowerLetter"/>
+      <w:lvlText w:val="%2."/>
+      <w:lvlJc w:val="left"/>
+      <w:pPr>
+        <w:ind w:left="1440" w:hanging="360"/>
+      </w:pPr>
+    </w:lvl>
+    <w:lvl w:ilvl="2" w:tplc="0416001B" w:tentative="1">
+      <w:start w:val="1"/>
+      <w:numFmt w:val="lowerRoman"/>
+      <w:lvlText w:val="%3."/>
+      <w:lvlJc w:val="right"/>
+      <w:pPr>
+        <w:ind w:left="2160" w:hanging="180"/>
+      </w:pPr>
+    </w:lvl>
+    <w:lvl w:ilvl="3" w:tplc="0416000F" w:tentative="1">
+      <w:start w:val="1"/>
+      <w:numFmt w:val="decimal"/>
+      <w:lvlText w:val="%4."/>
+      <w:lvlJc w:val="left"/>
+      <w:pPr>
+        <w:ind w:left="2880" w:hanging="360"/>
+      </w:pPr>
+    </w:lvl>
+    <w:lvl w:ilvl="4" w:tplc="04160019" w:tentative="1">
+      <w:start w:val="1"/>
+      <w:numFmt w:val="lowerLetter"/>
+      <w:lvlText w:val="%5."/>
+      <w:lvlJc w:val="left"/>
+      <w:pPr>
+        <w:ind w:left="3600" w:hanging="360"/>
+      </w:pPr>
+    </w:lvl>
+    <w:lvl w:ilvl="5" w:tplc="0416001B" w:tentative="1">
+      <w:start w:val="1"/>
+      <w:numFmt w:val="lowerRoman"/>
+      <w:lvlText w:val="%6."/>
+      <w:lvlJc w:val="right"/>
+      <w:pPr>
+        <w:ind w:left="4320" w:hanging="180"/>
+      </w:pPr>
+    </w:lvl>
+    <w:lvl w:ilvl="6" w:tplc="0416000F" w:tentative="1">
+      <w:start w:val="1"/>
+      <w:numFmt w:val="decimal"/>
+      <w:lvlText w:val="%7."/>
+      <w:lvlJc w:val="left"/>
+      <w:pPr>
+        <w:ind w:left="5040" w:hanging="360"/>
+      </w:pPr>
+    </w:lvl>
+    <w:lvl w:ilvl="7" w:tplc="04160019" w:tentative="1">
+      <w:start w:val="1"/>
+      <w:numFmt w:val="lowerLetter"/>
+      <w:lvlText w:val="%8."/>
+      <w:lvlJc w:val="left"/>
+      <w:pPr>
+        <w:ind w:left="5760" w:hanging="360"/>
+      </w:pPr>
+    </w:lvl>
+    <w:lvl w:ilvl="8" w:tplc="0416001B" w:tentative="1">
+      <w:start w:val="1"/>
+      <w:numFmt w:val="lowerRoman"/>
+      <w:lvlText w:val="%9."/>
+      <w:lvlJc w:val="right"/>
+      <w:pPr>
+        <w:ind w:left="6480" w:hanging="180"/>
+      </w:pPr>
+    </w:lvl>
+  </w:abstractNum>
+  <w:abstractNum w:abstractNumId="16" w15:restartNumberingAfterBreak="0">
     <w:nsid w:val="2F9777F1"/>
     <w:multiLevelType w:val="hybridMultilevel"/>
     <w:tmpl w:val="CC06ACF8"/>
@@ -4683,7 +4826,7 @@
       </w:rPr>
     </w:lvl>
   </w:abstractNum>
-  <w:abstractNum w:abstractNumId="16" w15:restartNumberingAfterBreak="0">
+  <w:abstractNum w:abstractNumId="17" w15:restartNumberingAfterBreak="0">
     <w:nsid w:val="301B2FA0"/>
     <w:multiLevelType w:val="hybridMultilevel"/>
     <w:tmpl w:val="9CE81608"/>
@@ -4796,7 +4939,7 @@
       </w:rPr>
     </w:lvl>
   </w:abstractNum>
-  <w:abstractNum w:abstractNumId="17" w15:restartNumberingAfterBreak="0">
+  <w:abstractNum w:abstractNumId="18" w15:restartNumberingAfterBreak="0">
     <w:nsid w:val="30805901"/>
     <w:multiLevelType w:val="hybridMultilevel"/>
     <w:tmpl w:val="33A819FA"/>
@@ -4909,7 +5052,7 @@
       </w:rPr>
     </w:lvl>
   </w:abstractNum>
-  <w:abstractNum w:abstractNumId="18" w15:restartNumberingAfterBreak="0">
+  <w:abstractNum w:abstractNumId="19" w15:restartNumberingAfterBreak="0">
     <w:nsid w:val="308A4A7A"/>
     <w:multiLevelType w:val="hybridMultilevel"/>
     <w:tmpl w:val="FAD67F7A"/>
@@ -5022,7 +5165,7 @@
       </w:rPr>
     </w:lvl>
   </w:abstractNum>
-  <w:abstractNum w:abstractNumId="19" w15:restartNumberingAfterBreak="0">
+  <w:abstractNum w:abstractNumId="20" w15:restartNumberingAfterBreak="0">
     <w:nsid w:val="311A7D3A"/>
     <w:multiLevelType w:val="hybridMultilevel"/>
     <w:tmpl w:val="D56637A6"/>
@@ -5135,7 +5278,7 @@
       </w:rPr>
     </w:lvl>
   </w:abstractNum>
-  <w:abstractNum w:abstractNumId="20" w15:restartNumberingAfterBreak="0">
+  <w:abstractNum w:abstractNumId="21" w15:restartNumberingAfterBreak="0">
     <w:nsid w:val="33B43F0F"/>
     <w:multiLevelType w:val="hybridMultilevel"/>
     <w:tmpl w:val="1602A55E"/>
@@ -5248,7 +5391,7 @@
       </w:rPr>
     </w:lvl>
   </w:abstractNum>
-  <w:abstractNum w:abstractNumId="21" w15:restartNumberingAfterBreak="0">
+  <w:abstractNum w:abstractNumId="22" w15:restartNumberingAfterBreak="0">
     <w:nsid w:val="36982A8C"/>
     <w:multiLevelType w:val="multilevel"/>
     <w:tmpl w:val="ECA635EA"/>
@@ -5397,7 +5540,7 @@
       </w:rPr>
     </w:lvl>
   </w:abstractNum>
-  <w:abstractNum w:abstractNumId="22" w15:restartNumberingAfterBreak="0">
+  <w:abstractNum w:abstractNumId="23" w15:restartNumberingAfterBreak="0">
     <w:nsid w:val="3E1A2C29"/>
     <w:multiLevelType w:val="hybridMultilevel"/>
     <w:tmpl w:val="9F8C27A8"/>
@@ -5510,7 +5653,7 @@
       </w:rPr>
     </w:lvl>
   </w:abstractNum>
-  <w:abstractNum w:abstractNumId="23" w15:restartNumberingAfterBreak="0">
+  <w:abstractNum w:abstractNumId="24" w15:restartNumberingAfterBreak="0">
     <w:nsid w:val="40C0561F"/>
     <w:multiLevelType w:val="multilevel"/>
     <w:tmpl w:val="7A3E0866"/>
@@ -5659,7 +5802,7 @@
       </w:rPr>
     </w:lvl>
   </w:abstractNum>
-  <w:abstractNum w:abstractNumId="24" w15:restartNumberingAfterBreak="0">
+  <w:abstractNum w:abstractNumId="25" w15:restartNumberingAfterBreak="0">
     <w:nsid w:val="49AF0F2D"/>
     <w:multiLevelType w:val="hybridMultilevel"/>
     <w:tmpl w:val="AC0CC258"/>
@@ -5772,7 +5915,7 @@
       </w:rPr>
     </w:lvl>
   </w:abstractNum>
-  <w:abstractNum w:abstractNumId="25" w15:restartNumberingAfterBreak="0">
+  <w:abstractNum w:abstractNumId="26" w15:restartNumberingAfterBreak="0">
     <w:nsid w:val="4FE7113A"/>
     <w:multiLevelType w:val="multilevel"/>
     <w:tmpl w:val="2940C23C"/>
@@ -5921,7 +6064,7 @@
       </w:rPr>
     </w:lvl>
   </w:abstractNum>
-  <w:abstractNum w:abstractNumId="26" w15:restartNumberingAfterBreak="0">
+  <w:abstractNum w:abstractNumId="27" w15:restartNumberingAfterBreak="0">
     <w:nsid w:val="55172998"/>
     <w:multiLevelType w:val="hybridMultilevel"/>
     <w:tmpl w:val="33A819FA"/>
@@ -6034,7 +6177,7 @@
       </w:rPr>
     </w:lvl>
   </w:abstractNum>
-  <w:abstractNum w:abstractNumId="27" w15:restartNumberingAfterBreak="0">
+  <w:abstractNum w:abstractNumId="28" w15:restartNumberingAfterBreak="0">
     <w:nsid w:val="55BB329E"/>
     <w:multiLevelType w:val="hybridMultilevel"/>
     <w:tmpl w:val="28A22746"/>
@@ -6120,7 +6263,7 @@
       </w:pPr>
     </w:lvl>
   </w:abstractNum>
-  <w:abstractNum w:abstractNumId="28" w15:restartNumberingAfterBreak="0">
+  <w:abstractNum w:abstractNumId="29" w15:restartNumberingAfterBreak="0">
     <w:nsid w:val="58FF0887"/>
     <w:multiLevelType w:val="hybridMultilevel"/>
     <w:tmpl w:val="CC428A74"/>
@@ -6233,7 +6376,7 @@
       </w:rPr>
     </w:lvl>
   </w:abstractNum>
-  <w:abstractNum w:abstractNumId="29" w15:restartNumberingAfterBreak="0">
+  <w:abstractNum w:abstractNumId="30" w15:restartNumberingAfterBreak="0">
     <w:nsid w:val="5A997288"/>
     <w:multiLevelType w:val="hybridMultilevel"/>
     <w:tmpl w:val="37DE8FBE"/>
@@ -6346,7 +6489,7 @@
       </w:rPr>
     </w:lvl>
   </w:abstractNum>
-  <w:abstractNum w:abstractNumId="30" w15:restartNumberingAfterBreak="0">
+  <w:abstractNum w:abstractNumId="31" w15:restartNumberingAfterBreak="0">
     <w:nsid w:val="5ADB3E62"/>
     <w:multiLevelType w:val="hybridMultilevel"/>
     <w:tmpl w:val="B4022DD2"/>
@@ -6432,7 +6575,7 @@
       </w:pPr>
     </w:lvl>
   </w:abstractNum>
-  <w:abstractNum w:abstractNumId="31" w15:restartNumberingAfterBreak="0">
+  <w:abstractNum w:abstractNumId="32" w15:restartNumberingAfterBreak="0">
     <w:nsid w:val="5D35034C"/>
     <w:multiLevelType w:val="multilevel"/>
     <w:tmpl w:val="4828771E"/>
@@ -6581,7 +6724,93 @@
       </w:rPr>
     </w:lvl>
   </w:abstractNum>
-  <w:abstractNum w:abstractNumId="32" w15:restartNumberingAfterBreak="0">
+  <w:abstractNum w:abstractNumId="33" w15:restartNumberingAfterBreak="0">
+    <w:nsid w:val="60881A92"/>
+    <w:multiLevelType w:val="multilevel"/>
+    <w:tmpl w:val="0416001F"/>
+    <w:lvl w:ilvl="0">
+      <w:start w:val="1"/>
+      <w:numFmt w:val="decimal"/>
+      <w:lvlText w:val="%1."/>
+      <w:lvlJc w:val="left"/>
+      <w:pPr>
+        <w:ind w:left="360" w:hanging="360"/>
+      </w:pPr>
+    </w:lvl>
+    <w:lvl w:ilvl="1">
+      <w:start w:val="1"/>
+      <w:numFmt w:val="decimal"/>
+      <w:lvlText w:val="%1.%2."/>
+      <w:lvlJc w:val="left"/>
+      <w:pPr>
+        <w:ind w:left="792" w:hanging="432"/>
+      </w:pPr>
+    </w:lvl>
+    <w:lvl w:ilvl="2">
+      <w:start w:val="1"/>
+      <w:numFmt w:val="decimal"/>
+      <w:lvlText w:val="%1.%2.%3."/>
+      <w:lvlJc w:val="left"/>
+      <w:pPr>
+        <w:ind w:left="1224" w:hanging="504"/>
+      </w:pPr>
+    </w:lvl>
+    <w:lvl w:ilvl="3">
+      <w:start w:val="1"/>
+      <w:numFmt w:val="decimal"/>
+      <w:lvlText w:val="%1.%2.%3.%4."/>
+      <w:lvlJc w:val="left"/>
+      <w:pPr>
+        <w:ind w:left="1728" w:hanging="648"/>
+      </w:pPr>
+    </w:lvl>
+    <w:lvl w:ilvl="4">
+      <w:start w:val="1"/>
+      <w:numFmt w:val="decimal"/>
+      <w:lvlText w:val="%1.%2.%3.%4.%5."/>
+      <w:lvlJc w:val="left"/>
+      <w:pPr>
+        <w:ind w:left="2232" w:hanging="792"/>
+      </w:pPr>
+    </w:lvl>
+    <w:lvl w:ilvl="5">
+      <w:start w:val="1"/>
+      <w:numFmt w:val="decimal"/>
+      <w:lvlText w:val="%1.%2.%3.%4.%5.%6."/>
+      <w:lvlJc w:val="left"/>
+      <w:pPr>
+        <w:ind w:left="2736" w:hanging="936"/>
+      </w:pPr>
+    </w:lvl>
+    <w:lvl w:ilvl="6">
+      <w:start w:val="1"/>
+      <w:numFmt w:val="decimal"/>
+      <w:lvlText w:val="%1.%2.%3.%4.%5.%6.%7."/>
+      <w:lvlJc w:val="left"/>
+      <w:pPr>
+        <w:ind w:left="3240" w:hanging="1080"/>
+      </w:pPr>
+    </w:lvl>
+    <w:lvl w:ilvl="7">
+      <w:start w:val="1"/>
+      <w:numFmt w:val="decimal"/>
+      <w:lvlText w:val="%1.%2.%3.%4.%5.%6.%7.%8."/>
+      <w:lvlJc w:val="left"/>
+      <w:pPr>
+        <w:ind w:left="3744" w:hanging="1224"/>
+      </w:pPr>
+    </w:lvl>
+    <w:lvl w:ilvl="8">
+      <w:start w:val="1"/>
+      <w:numFmt w:val="decimal"/>
+      <w:lvlText w:val="%1.%2.%3.%4.%5.%6.%7.%8.%9."/>
+      <w:lvlJc w:val="left"/>
+      <w:pPr>
+        <w:ind w:left="4320" w:hanging="1440"/>
+      </w:pPr>
+    </w:lvl>
+  </w:abstractNum>
+  <w:abstractNum w:abstractNumId="34" w15:restartNumberingAfterBreak="0">
     <w:nsid w:val="637A1DAB"/>
     <w:multiLevelType w:val="hybridMultilevel"/>
     <w:tmpl w:val="E42879CC"/>
@@ -6694,7 +6923,7 @@
       </w:rPr>
     </w:lvl>
   </w:abstractNum>
-  <w:abstractNum w:abstractNumId="33" w15:restartNumberingAfterBreak="0">
+  <w:abstractNum w:abstractNumId="35" w15:restartNumberingAfterBreak="0">
     <w:nsid w:val="658E3331"/>
     <w:multiLevelType w:val="hybridMultilevel"/>
     <w:tmpl w:val="543279A0"/>
@@ -6780,7 +7009,7 @@
       </w:pPr>
     </w:lvl>
   </w:abstractNum>
-  <w:abstractNum w:abstractNumId="34" w15:restartNumberingAfterBreak="0">
+  <w:abstractNum w:abstractNumId="36" w15:restartNumberingAfterBreak="0">
     <w:nsid w:val="6D7D32A0"/>
     <w:multiLevelType w:val="hybridMultilevel"/>
     <w:tmpl w:val="33A819FA"/>
@@ -6893,7 +7122,7 @@
       </w:rPr>
     </w:lvl>
   </w:abstractNum>
-  <w:abstractNum w:abstractNumId="35" w15:restartNumberingAfterBreak="0">
+  <w:abstractNum w:abstractNumId="37" w15:restartNumberingAfterBreak="0">
     <w:nsid w:val="6EF62915"/>
     <w:multiLevelType w:val="multilevel"/>
     <w:tmpl w:val="6896A556"/>
@@ -7006,7 +7235,7 @@
       </w:pPr>
     </w:lvl>
   </w:abstractNum>
-  <w:abstractNum w:abstractNumId="36" w15:restartNumberingAfterBreak="0">
+  <w:abstractNum w:abstractNumId="38" w15:restartNumberingAfterBreak="0">
     <w:nsid w:val="74942A01"/>
     <w:multiLevelType w:val="hybridMultilevel"/>
     <w:tmpl w:val="5126A770"/>
@@ -7119,7 +7348,7 @@
       </w:rPr>
     </w:lvl>
   </w:abstractNum>
-  <w:abstractNum w:abstractNumId="37" w15:restartNumberingAfterBreak="0">
+  <w:abstractNum w:abstractNumId="39" w15:restartNumberingAfterBreak="0">
     <w:nsid w:val="7BDF5E5B"/>
     <w:multiLevelType w:val="hybridMultilevel"/>
     <w:tmpl w:val="403A784C"/>
@@ -7232,7 +7461,7 @@
       </w:rPr>
     </w:lvl>
   </w:abstractNum>
-  <w:abstractNum w:abstractNumId="38" w15:restartNumberingAfterBreak="0">
+  <w:abstractNum w:abstractNumId="40" w15:restartNumberingAfterBreak="0">
     <w:nsid w:val="7E794268"/>
     <w:multiLevelType w:val="hybridMultilevel"/>
     <w:tmpl w:val="C14ADFF8"/>
@@ -7345,7 +7574,7 @@
       </w:rPr>
     </w:lvl>
   </w:abstractNum>
-  <w:abstractNum w:abstractNumId="39" w15:restartNumberingAfterBreak="0">
+  <w:abstractNum w:abstractNumId="41" w15:restartNumberingAfterBreak="0">
     <w:nsid w:val="7EDA35B6"/>
     <w:multiLevelType w:val="hybridMultilevel"/>
     <w:tmpl w:val="E034E134"/>
@@ -7458,7 +7687,7 @@
       </w:rPr>
     </w:lvl>
   </w:abstractNum>
-  <w:abstractNum w:abstractNumId="40" w15:restartNumberingAfterBreak="0">
+  <w:abstractNum w:abstractNumId="42" w15:restartNumberingAfterBreak="0">
     <w:nsid w:val="7FDD03AF"/>
     <w:multiLevelType w:val="hybridMultilevel"/>
     <w:tmpl w:val="F78A2A42"/>
@@ -7587,7 +7816,7 @@
     <w:abstractNumId w:val="1"/>
   </w:num>
   <w:num w:numId="6" w16cid:durableId="925456068">
-    <w:abstractNumId w:val="32"/>
+    <w:abstractNumId w:val="34"/>
   </w:num>
   <w:num w:numId="7" w16cid:durableId="1806270440">
     <w:abstractNumId w:val="13"/>
@@ -7596,22 +7825,22 @@
     </w:lvlOverride>
   </w:num>
   <w:num w:numId="8" w16cid:durableId="665935092">
-    <w:abstractNumId w:val="31"/>
+    <w:abstractNumId w:val="32"/>
   </w:num>
   <w:num w:numId="9" w16cid:durableId="1597713199">
-    <w:abstractNumId w:val="36"/>
+    <w:abstractNumId w:val="38"/>
   </w:num>
   <w:num w:numId="10" w16cid:durableId="1226182326">
     <w:abstractNumId w:val="7"/>
   </w:num>
   <w:num w:numId="11" w16cid:durableId="190842281">
-    <w:abstractNumId w:val="33"/>
+    <w:abstractNumId w:val="35"/>
   </w:num>
   <w:num w:numId="12" w16cid:durableId="1186751575">
-    <w:abstractNumId w:val="23"/>
+    <w:abstractNumId w:val="24"/>
   </w:num>
   <w:num w:numId="13" w16cid:durableId="759713735">
-    <w:abstractNumId w:val="30"/>
+    <w:abstractNumId w:val="31"/>
   </w:num>
   <w:num w:numId="14" w16cid:durableId="1772889994">
     <w:abstractNumId w:val="5"/>
@@ -7620,49 +7849,49 @@
     <w:abstractNumId w:val="8"/>
   </w:num>
   <w:num w:numId="16" w16cid:durableId="1966277245">
-    <w:abstractNumId w:val="18"/>
+    <w:abstractNumId w:val="19"/>
   </w:num>
   <w:num w:numId="17" w16cid:durableId="60060370">
-    <w:abstractNumId w:val="22"/>
+    <w:abstractNumId w:val="23"/>
   </w:num>
   <w:num w:numId="18" w16cid:durableId="1570919533">
     <w:abstractNumId w:val="14"/>
   </w:num>
   <w:num w:numId="19" w16cid:durableId="46532747">
-    <w:abstractNumId w:val="37"/>
+    <w:abstractNumId w:val="39"/>
   </w:num>
   <w:num w:numId="20" w16cid:durableId="1317614995">
     <w:abstractNumId w:val="2"/>
   </w:num>
   <w:num w:numId="21" w16cid:durableId="1720784358">
+    <w:abstractNumId w:val="22"/>
+  </w:num>
+  <w:num w:numId="22" w16cid:durableId="919363944">
+    <w:abstractNumId w:val="18"/>
+  </w:num>
+  <w:num w:numId="23" w16cid:durableId="1776168837">
     <w:abstractNumId w:val="21"/>
   </w:num>
-  <w:num w:numId="22" w16cid:durableId="919363944">
-    <w:abstractNumId w:val="17"/>
-  </w:num>
-  <w:num w:numId="23" w16cid:durableId="1776168837">
-    <w:abstractNumId w:val="20"/>
-  </w:num>
   <w:num w:numId="24" w16cid:durableId="1363047817">
-    <w:abstractNumId w:val="34"/>
+    <w:abstractNumId w:val="36"/>
   </w:num>
   <w:num w:numId="25" w16cid:durableId="1465462095">
-    <w:abstractNumId w:val="26"/>
+    <w:abstractNumId w:val="27"/>
   </w:num>
   <w:num w:numId="26" w16cid:durableId="2072805064">
-    <w:abstractNumId w:val="40"/>
+    <w:abstractNumId w:val="42"/>
   </w:num>
   <w:num w:numId="27" w16cid:durableId="774247639">
     <w:abstractNumId w:val="12"/>
   </w:num>
   <w:num w:numId="28" w16cid:durableId="1695383268">
-    <w:abstractNumId w:val="27"/>
+    <w:abstractNumId w:val="28"/>
   </w:num>
   <w:num w:numId="29" w16cid:durableId="595942647">
-    <w:abstractNumId w:val="24"/>
+    <w:abstractNumId w:val="25"/>
   </w:num>
   <w:num w:numId="30" w16cid:durableId="300425422">
-    <w:abstractNumId w:val="15"/>
+    <w:abstractNumId w:val="16"/>
   </w:num>
   <w:num w:numId="31" w16cid:durableId="1284193843">
     <w:abstractNumId w:val="11"/>
@@ -7671,31 +7900,37 @@
     <w:abstractNumId w:val="10"/>
   </w:num>
   <w:num w:numId="33" w16cid:durableId="1299649816">
-    <w:abstractNumId w:val="39"/>
+    <w:abstractNumId w:val="41"/>
   </w:num>
   <w:num w:numId="34" w16cid:durableId="609623656">
-    <w:abstractNumId w:val="19"/>
+    <w:abstractNumId w:val="20"/>
   </w:num>
   <w:num w:numId="35" w16cid:durableId="763889348">
-    <w:abstractNumId w:val="16"/>
+    <w:abstractNumId w:val="17"/>
   </w:num>
   <w:num w:numId="36" w16cid:durableId="585765071">
     <w:abstractNumId w:val="9"/>
   </w:num>
   <w:num w:numId="37" w16cid:durableId="677195464">
+    <w:abstractNumId w:val="30"/>
+  </w:num>
+  <w:num w:numId="38" w16cid:durableId="831873325">
+    <w:abstractNumId w:val="37"/>
+  </w:num>
+  <w:num w:numId="39" w16cid:durableId="2116778491">
+    <w:abstractNumId w:val="26"/>
+  </w:num>
+  <w:num w:numId="40" w16cid:durableId="1264461571">
     <w:abstractNumId w:val="29"/>
   </w:num>
-  <w:num w:numId="38" w16cid:durableId="831873325">
-    <w:abstractNumId w:val="35"/>
+  <w:num w:numId="41" w16cid:durableId="1518618404">
+    <w:abstractNumId w:val="40"/>
   </w:num>
-  <w:num w:numId="39" w16cid:durableId="2116778491">
-    <w:abstractNumId w:val="25"/>
+  <w:num w:numId="42" w16cid:durableId="1230921124">
+    <w:abstractNumId w:val="15"/>
   </w:num>
-  <w:num w:numId="40" w16cid:durableId="1264461571">
-    <w:abstractNumId w:val="28"/>
-  </w:num>
-  <w:num w:numId="41" w16cid:durableId="1518618404">
-    <w:abstractNumId w:val="38"/>
+  <w:num w:numId="43" w16cid:durableId="848368136">
+    <w:abstractNumId w:val="33"/>
   </w:num>
 </w:numbering>
 </file>
@@ -8100,7 +8335,7 @@
   <w:style w:type="paragraph" w:default="1" w:styleId="Normal">
     <w:name w:val="Normal"/>
     <w:qFormat/>
-    <w:rsid w:val="00B34C10"/>
+    <w:rsid w:val="00CE65DC"/>
   </w:style>
   <w:style w:type="paragraph" w:styleId="Ttulo1">
     <w:name w:val="heading 1"/>
@@ -8301,7 +8536,6 @@
   <w:style w:type="character" w:default="1" w:styleId="Fontepargpadro">
     <w:name w:val="Default Paragraph Font"/>
     <w:uiPriority w:val="1"/>
-    <w:semiHidden/>
     <w:unhideWhenUsed/>
   </w:style>
   <w:style w:type="table" w:default="1" w:styleId="Tabelanormal">

</xml_diff>

<commit_message>
Atualizacao do Documento tecnico
</commit_message>
<xml_diff>
--- a/docs/RELATORIO_TechChallenge_FASE2.docx
+++ b/docs/RELATORIO_TechChallenge_FASE2.docx
@@ -1271,7 +1271,7 @@
           <v:shape id="_x0000_i1026" type="#_x0000_t75" style="width:78pt;height:48pt" o:ole="">
             <v:imagedata r:id="rId11" o:title=""/>
           </v:shape>
-          <o:OLEObject Type="Embed" ProgID="Word.Document.12" ShapeID="_x0000_i1026" DrawAspect="Icon" ObjectID="_1832727876" r:id="rId12">
+          <o:OLEObject Type="Embed" ProgID="Word.Document.12" ShapeID="_x0000_i1026" DrawAspect="Icon" ObjectID="_1832854356" r:id="rId12">
             <o:FieldCodes>\s</o:FieldCodes>
           </o:OLEObject>
         </w:object>
@@ -1674,6 +1674,43 @@
       </w:r>
       <w:r>
         <w:t>\modelos --&gt; contém as classes</w:t>
+      </w:r>
+    </w:p>
+    <w:p>
+      <w:r>
+        <w:rPr>
+          <w:i/>
+          <w:iCs/>
+          <w:color w:val="EE0000"/>
+        </w:rPr>
+        <w:t>&lt;base&gt;</w:t>
+      </w:r>
+      <w:r>
+        <w:t>\</w:t>
+      </w:r>
+      <w:r>
+        <w:t xml:space="preserve">data </w:t>
+      </w:r>
+      <w:r>
+        <w:sym w:font="Wingdings" w:char="F0E0"/>
+      </w:r>
+      <w:r>
+        <w:t xml:space="preserve"> </w:t>
+      </w:r>
+      <w:r>
+        <w:t>contém</w:t>
+      </w:r>
+      <w:r>
+        <w:t xml:space="preserve"> o modelo, metadados do modelo (informações estatísticas e </w:t>
+      </w:r>
+      <w:r>
+        <w:t>última</w:t>
+      </w:r>
+      <w:r>
+        <w:t xml:space="preserve"> data de treinamento) e </w:t>
+      </w:r>
+      <w:r>
+        <w:t>os dados de treino e testes.</w:t>
       </w:r>
     </w:p>
     <w:p>
@@ -8335,7 +8372,7 @@
   <w:style w:type="paragraph" w:default="1" w:styleId="Normal">
     <w:name w:val="Normal"/>
     <w:qFormat/>
-    <w:rsid w:val="00CE65DC"/>
+    <w:rsid w:val="00C57B38"/>
   </w:style>
   <w:style w:type="paragraph" w:styleId="Ttulo1">
     <w:name w:val="heading 1"/>

</xml_diff>